<commit_message>
Enxuga ementa (-22%) e voto (-35%) da APC 0703514-37 e confere nos autos de origem
Co-Authored-By: Claude Sonnet 5.5 <noreply@anthropic.com>
Claude-Session: https://claude.ai/code/session_01TWDXExjmpjF9kCp9JMeKxg
</commit_message>
<xml_diff>
--- a/entregas-0703514/9 APC 0703514-37 ACA Marcos NP ação inexistência débito e danos morais.docx
+++ b/entregas-0703514/9 APC 0703514-37 ACA Marcos NP ação inexistência débito e danos morais.docx
@@ -1083,7 +1083,7 @@
           <w:szCs w:val="28"/>
         </w:rPr>
       </w:pPr>
-      <w:commentRangeStart w:id="25"/>
+      <w:commentRangeStart w:id="24"/>
       <w:r>
         <w:rPr>
           <w:rFonts w:ascii="Arial" w:hAnsi="Arial" w:cs="Arial"/>
@@ -1148,12 +1148,12 @@
         </w:rPr>
         <w:t xml:space="preserve"> </w:t>
       </w:r>
-      <w:commentRangeEnd w:id="25"/>
+      <w:commentRangeEnd w:id="24"/>
       <w:r>
         <w:rPr>
           <w:rStyle w:val="CommentReference"/>
         </w:rPr>
-        <w:commentReference w:id="25"/>
+        <w:commentReference w:id="24"/>
       </w:r>
     </w:p>
     <w:p>
@@ -1326,7 +1326,7 @@
           <w:sz w:val="28"/>
           <w:szCs w:val="28"/>
         </w:rPr>
-        <w:t xml:space="preserve">2. A sentença julgou improcedentes os pedidos de declaração de inexistência de débito, de exclusão da anotação correspondente e de condenação ao pagamento de indenização por danos morais.</w:t>
+        <w:t xml:space="preserve">2. A sentença julgou improcedentes os pedidos de declaração de inexistência de débito, de exclusão da anotação e de indenização por danos morais.</w:t>
       </w:r>
     </w:p>
     <w:p>
@@ -1345,7 +1345,7 @@
           <w:color w:val="808080"/>
           <w:sz w:val="28"/>
         </w:rPr>
-        <w:t xml:space="preserve">3. A autora apelou sustentando que o apelado não comprovou a contratação nem a origem do débito, que a cessão de crédito não supre essa prova e que a cobrança e o registro em plataforma de crédito configuram falha na prestação do serviço e dano moral.</w:t>
+        <w:t xml:space="preserve">3. A autora apelou, alegando falta de prova da contratação e da origem do débito, falha na prestação do serviço e dano moral.</w:t>
       </w:r>
     </w:p>
     <w:p>
@@ -1457,7 +1457,49 @@
           <w:sz w:val="28"/>
           <w:szCs w:val="28"/>
         </w:rPr>
-        <w:t xml:space="preserve">se, impugnada a contratação em relação de consumo, o credor se desincumbiu do ônus de comprovar a existência do vínculo e a origem do débito; (ii) </w:t>
+        <w:t xml:space="preserve">se</w:t>
+      </w:r>
+      <w:r>
+        <w:rPr>
+          <w:rFonts w:ascii="Arial" w:eastAsia="Arial" w:hAnsi="Arial" w:cs="Arial"/>
+          <w:sz w:val="28"/>
+          <w:szCs w:val="28"/>
+        </w:rPr>
+        <w:t xml:space="preserve"> o credor </w:t>
+      </w:r>
+      <w:r>
+        <w:rPr>
+          <w:rFonts w:ascii="Arial" w:eastAsia="Arial" w:hAnsi="Arial" w:cs="Arial"/>
+          <w:color w:val="808080"/>
+          <w:sz w:val="28"/>
+          <w:szCs w:val="28"/>
+        </w:rPr>
+        <w:t xml:space="preserve">comprovou</w:t>
+      </w:r>
+      <w:r>
+        <w:rPr>
+          <w:rFonts w:ascii="Arial" w:eastAsia="Arial" w:hAnsi="Arial" w:cs="Arial"/>
+          <w:sz w:val="28"/>
+          <w:szCs w:val="28"/>
+        </w:rPr>
+        <w:t xml:space="preserve"> </w:t>
+      </w:r>
+      <w:r>
+        <w:rPr>
+          <w:rFonts w:ascii="Arial" w:eastAsia="Arial" w:hAnsi="Arial" w:cs="Arial"/>
+          <w:color w:val="808080"/>
+          <w:sz w:val="28"/>
+          <w:szCs w:val="28"/>
+        </w:rPr>
+        <w:t xml:space="preserve">o</w:t>
+      </w:r>
+      <w:r>
+        <w:rPr>
+          <w:rFonts w:ascii="Arial" w:eastAsia="Arial" w:hAnsi="Arial" w:cs="Arial"/>
+          <w:sz w:val="28"/>
+          <w:szCs w:val="28"/>
+        </w:rPr>
+        <w:t xml:space="preserve"> vínculo e a origem do débito; (ii) </w:t>
       </w:r>
       <w:r>
         <w:rPr>
@@ -1473,7 +1515,15 @@
           <w:sz w:val="28"/>
           <w:szCs w:val="28"/>
         </w:rPr>
-        <w:t xml:space="preserve">se a cessão de crédito, comprovada por certidão de registro, vincula a consumidora à obrigação transferida ao cessionário e autoriza a cobrança; (iii) </w:t>
+        <w:t xml:space="preserve">se a cessão de crédito</w:t>
+      </w:r>
+      <w:r>
+        <w:rPr>
+          <w:rFonts w:ascii="Arial" w:eastAsia="Arial" w:hAnsi="Arial" w:cs="Arial"/>
+          <w:sz w:val="28"/>
+          <w:szCs w:val="28"/>
+        </w:rPr>
+        <w:t xml:space="preserve"> autoriza a cobrança; (iii) </w:t>
       </w:r>
       <w:r>
         <w:rPr>
@@ -1489,7 +1539,15 @@
           <w:sz w:val="28"/>
           <w:szCs w:val="28"/>
         </w:rPr>
-        <w:t xml:space="preserve">se a cobrança e a anotação do débito em plataforma de crédito configuram falha na prestação do serviço; e (iv) </w:t>
+        <w:t xml:space="preserve">se a cobrança e a anotação </w:t>
+      </w:r>
+      <w:r>
+        <w:rPr>
+          <w:rFonts w:ascii="Arial" w:eastAsia="Arial" w:hAnsi="Arial" w:cs="Arial"/>
+          <w:sz w:val="28"/>
+          <w:szCs w:val="28"/>
+        </w:rPr>
+        <w:t xml:space="preserve">configuram falha na prestação do serviço; e (iv) </w:t>
       </w:r>
       <w:r>
         <w:rPr>
@@ -1505,7 +1563,24 @@
           <w:sz w:val="28"/>
           <w:szCs w:val="28"/>
         </w:rPr>
-        <w:t xml:space="preserve">se estão presentes os pressupostos para a condenação ao pagamento de indenização por danos morais.</w:t>
+        <w:t xml:space="preserve">se </w:t>
+      </w:r>
+      <w:r>
+        <w:rPr>
+          <w:rFonts w:ascii="Arial" w:eastAsia="Arial" w:hAnsi="Arial" w:cs="Arial"/>
+          <w:color w:val="808080"/>
+          <w:sz w:val="28"/>
+          <w:szCs w:val="28"/>
+        </w:rPr>
+        <w:t xml:space="preserve">cabe</w:t>
+      </w:r>
+      <w:r>
+        <w:rPr>
+          <w:rFonts w:ascii="Arial" w:eastAsia="Arial" w:hAnsi="Arial" w:cs="Arial"/>
+          <w:sz w:val="28"/>
+          <w:szCs w:val="28"/>
+        </w:rPr>
+        <w:t xml:space="preserve"> indenização por danos morais.</w:t>
       </w:r>
     </w:p>
     <w:p>
@@ -1575,32 +1650,49 @@
           <w:sz w:val="28"/>
           <w:szCs w:val="28"/>
         </w:rPr>
-        <w:t xml:space="preserve"> inversão do ônus da prova</w:t>
-      </w:r>
-      <w:r>
-        <w:rPr>
-          <w:rFonts w:ascii="Arial" w:eastAsia="Arial" w:hAnsi="Arial" w:cs="Arial"/>
-          <w:sz w:val="28"/>
-          <w:szCs w:val="28"/>
-        </w:rPr>
-        <w:t xml:space="preserve"> não é automática e mostra-se desnecessária quando a controvérsia é eminentemente documental e a prova já consta dos autos</w:t>
-      </w:r>
-      <w:r>
-        <w:rPr>
-          <w:rFonts w:ascii="Arial" w:eastAsia="Arial" w:hAnsi="Arial" w:cs="Arial"/>
-          <w:color w:val="808080"/>
-          <w:sz w:val="28"/>
-          <w:szCs w:val="28"/>
-        </w:rPr>
-        <w:t xml:space="preserve"> (CDC 6º VIII)</w:t>
-      </w:r>
-      <w:r>
-        <w:rPr>
-          <w:rFonts w:ascii="Arial" w:eastAsia="Arial" w:hAnsi="Arial" w:cs="Arial"/>
-          <w:sz w:val="28"/>
-          <w:szCs w:val="28"/>
-        </w:rPr>
-        <w:t xml:space="preserve">. Negada a contratação, incumbe ao réu demonstrar a existência do vínculo e a origem do débito</w:t>
+        <w:t xml:space="preserve"> inversão do ônus da prova </w:t>
+      </w:r>
+      <w:r>
+        <w:rPr>
+          <w:rFonts w:ascii="Arial" w:eastAsia="Arial" w:hAnsi="Arial" w:cs="Arial"/>
+          <w:sz w:val="28"/>
+          <w:szCs w:val="28"/>
+        </w:rPr>
+        <w:t xml:space="preserve">não é automática e </w:t>
+      </w:r>
+      <w:r>
+        <w:rPr>
+          <w:rFonts w:ascii="Arial" w:eastAsia="Arial" w:hAnsi="Arial" w:cs="Arial"/>
+          <w:color w:val="808080"/>
+          <w:sz w:val="28"/>
+          <w:szCs w:val="28"/>
+        </w:rPr>
+        <w:t xml:space="preserve">é</w:t>
+      </w:r>
+      <w:r>
+        <w:rPr>
+          <w:rFonts w:ascii="Arial" w:eastAsia="Arial" w:hAnsi="Arial" w:cs="Arial"/>
+          <w:sz w:val="28"/>
+          <w:szCs w:val="28"/>
+        </w:rPr>
+        <w:t xml:space="preserve"> desnecessária quando a controvérsia é </w:t>
+      </w:r>
+      <w:r>
+        <w:rPr>
+          <w:rFonts w:ascii="Arial" w:eastAsia="Arial" w:hAnsi="Arial" w:cs="Arial"/>
+          <w:sz w:val="28"/>
+          <w:szCs w:val="28"/>
+        </w:rPr>
+        <w:t xml:space="preserve">documental </w:t>
+      </w:r>
+      <w:r>
+        <w:rPr>
+          <w:rFonts w:ascii="Arial" w:eastAsia="Arial" w:hAnsi="Arial" w:cs="Arial"/>
+          <w:color w:val="808080"/>
+          <w:sz w:val="28"/>
+          <w:szCs w:val="28"/>
+        </w:rPr>
+        <w:t xml:space="preserve">(CDC</w:t>
       </w:r>
       <w:r>
         <w:rPr>
@@ -1617,6 +1709,65 @@
           <w:sz w:val="28"/>
           <w:szCs w:val="28"/>
         </w:rPr>
+        <w:t xml:space="preserve">6º</w:t>
+      </w:r>
+      <w:r>
+        <w:rPr>
+          <w:rFonts w:ascii="Arial" w:eastAsia="Arial" w:hAnsi="Arial" w:cs="Arial"/>
+          <w:sz w:val="28"/>
+          <w:szCs w:val="28"/>
+        </w:rPr>
+        <w:t xml:space="preserve"> </w:t>
+      </w:r>
+      <w:r>
+        <w:rPr>
+          <w:rFonts w:ascii="Arial" w:eastAsia="Arial" w:hAnsi="Arial" w:cs="Arial"/>
+          <w:color w:val="808080"/>
+          <w:sz w:val="28"/>
+          <w:szCs w:val="28"/>
+        </w:rPr>
+        <w:t xml:space="preserve">VIII)</w:t>
+      </w:r>
+      <w:r>
+        <w:rPr>
+          <w:rFonts w:ascii="Arial" w:eastAsia="Arial" w:hAnsi="Arial" w:cs="Arial"/>
+          <w:sz w:val="28"/>
+          <w:szCs w:val="28"/>
+        </w:rPr>
+        <w:t xml:space="preserve">. Negada a contratação, incumbe ao réu demonstrar </w:t>
+      </w:r>
+      <w:r>
+        <w:rPr>
+          <w:rFonts w:ascii="Arial" w:eastAsia="Arial" w:hAnsi="Arial" w:cs="Arial"/>
+          <w:color w:val="808080"/>
+          <w:sz w:val="28"/>
+          <w:szCs w:val="28"/>
+        </w:rPr>
+        <w:t xml:space="preserve">o</w:t>
+      </w:r>
+      <w:r>
+        <w:rPr>
+          <w:rFonts w:ascii="Arial" w:eastAsia="Arial" w:hAnsi="Arial" w:cs="Arial"/>
+          <w:sz w:val="28"/>
+          <w:szCs w:val="28"/>
+        </w:rPr>
+        <w:t xml:space="preserve"> vínculo e a origem do débito</w:t>
+      </w:r>
+      <w:r>
+        <w:rPr>
+          <w:rFonts w:ascii="Arial" w:eastAsia="Arial" w:hAnsi="Arial" w:cs="Arial"/>
+          <w:sz w:val="28"/>
+          <w:szCs w:val="28"/>
+        </w:rPr>
+        <w:t xml:space="preserve"> </w:t>
+      </w:r>
+      <w:r>
+        <w:rPr>
+          <w:rFonts w:ascii="Arial" w:eastAsia="Arial" w:hAnsi="Arial" w:cs="Arial"/>
+          <w:color w:val="808080"/>
+          <w:sz w:val="28"/>
+          <w:szCs w:val="28"/>
+        </w:rPr>
         <w:t xml:space="preserve">(CPC</w:t>
       </w:r>
       <w:r>
@@ -1687,7 +1838,83 @@
           <w:sz w:val="28"/>
           <w:szCs w:val="28"/>
         </w:rPr>
-        <w:t xml:space="preserve">Comprova a relação jurídica a juntada de contrato assinado com dados pessoais, endereço e documento de identificação coincidentes com os apresentados pela consumidora. Ausente impugnação específica da autenticidade da assinatura, não se transfere ao </w:t>
+        <w:t xml:space="preserve">Comprova a relação jurídica </w:t>
+      </w:r>
+      <w:r>
+        <w:rPr>
+          <w:rFonts w:ascii="Arial" w:eastAsia="Arial" w:hAnsi="Arial" w:cs="Arial"/>
+          <w:color w:val="808080"/>
+          <w:sz w:val="28"/>
+          <w:szCs w:val="28"/>
+        </w:rPr>
+        <w:t xml:space="preserve">o</w:t>
+      </w:r>
+      <w:r>
+        <w:rPr>
+          <w:rFonts w:ascii="Arial" w:eastAsia="Arial" w:hAnsi="Arial" w:cs="Arial"/>
+          <w:sz w:val="28"/>
+          <w:szCs w:val="28"/>
+        </w:rPr>
+        <w:t xml:space="preserve"> contrato assinado com dados pessoais, endereço e documento de identificação coincidentes com os </w:t>
+      </w:r>
+      <w:r>
+        <w:rPr>
+          <w:rFonts w:ascii="Arial" w:eastAsia="Arial" w:hAnsi="Arial" w:cs="Arial"/>
+          <w:color w:val="808080"/>
+          <w:sz w:val="28"/>
+          <w:szCs w:val="28"/>
+        </w:rPr>
+        <w:t xml:space="preserve">da</w:t>
+      </w:r>
+      <w:r>
+        <w:rPr>
+          <w:rFonts w:ascii="Arial" w:eastAsia="Arial" w:hAnsi="Arial" w:cs="Arial"/>
+          <w:sz w:val="28"/>
+          <w:szCs w:val="28"/>
+        </w:rPr>
+        <w:t xml:space="preserve"> consumidora. </w:t>
+      </w:r>
+      <w:r>
+        <w:rPr>
+          <w:rFonts w:ascii="Arial" w:eastAsia="Arial" w:hAnsi="Arial" w:cs="Arial"/>
+          <w:color w:val="808080"/>
+          <w:sz w:val="28"/>
+          <w:szCs w:val="28"/>
+        </w:rPr>
+        <w:t xml:space="preserve">Sem</w:t>
+      </w:r>
+      <w:r>
+        <w:rPr>
+          <w:rFonts w:ascii="Arial" w:eastAsia="Arial" w:hAnsi="Arial" w:cs="Arial"/>
+          <w:sz w:val="28"/>
+          <w:szCs w:val="28"/>
+        </w:rPr>
+        <w:t xml:space="preserve"> impugnação específica da </w:t>
+      </w:r>
+      <w:r>
+        <w:rPr>
+          <w:rFonts w:ascii="Arial" w:eastAsia="Arial" w:hAnsi="Arial" w:cs="Arial"/>
+          <w:sz w:val="28"/>
+          <w:szCs w:val="28"/>
+        </w:rPr>
+        <w:t xml:space="preserve">assinatura,</w:t>
+      </w:r>
+      <w:r>
+        <w:rPr>
+          <w:rFonts w:ascii="Arial" w:eastAsia="Arial" w:hAnsi="Arial" w:cs="Arial"/>
+          <w:color w:val="808080"/>
+          <w:sz w:val="28"/>
+          <w:szCs w:val="28"/>
+        </w:rPr>
+        <w:t xml:space="preserve"> o ônus de demonstrá-la</w:t>
+      </w:r>
+      <w:r>
+        <w:rPr>
+          <w:rFonts w:ascii="Arial" w:eastAsia="Arial" w:hAnsi="Arial" w:cs="Arial"/>
+          <w:sz w:val="28"/>
+          <w:szCs w:val="28"/>
+        </w:rPr>
+        <w:t xml:space="preserve"> não se transfere ao </w:t>
       </w:r>
       <w:r>
         <w:rPr>
@@ -1700,19 +1927,28 @@
       <w:r>
         <w:rPr>
           <w:rFonts w:ascii="Arial" w:eastAsia="Arial" w:hAnsi="Arial" w:cs="Arial"/>
-          <w:sz w:val="28"/>
-          <w:szCs w:val="28"/>
-        </w:rPr>
-        <w:t xml:space="preserve">o ônus de demonstrá-la</w:t>
-      </w:r>
-      <w:r>
-        <w:rPr>
-          <w:rFonts w:ascii="Arial" w:eastAsia="Arial" w:hAnsi="Arial" w:cs="Arial"/>
-          <w:color w:val="808080"/>
-          <w:sz w:val="28"/>
-          <w:szCs w:val="28"/>
-        </w:rPr>
-        <w:t xml:space="preserve"> (Tema 1</w:t>
+          <w:color w:val="808080"/>
+          <w:sz w:val="28"/>
+          <w:szCs w:val="28"/>
+        </w:rPr>
+        <w:t xml:space="preserve">(Tema</w:t>
+      </w:r>
+      <w:r>
+        <w:rPr>
+          <w:rFonts w:ascii="Arial" w:eastAsia="Arial" w:hAnsi="Arial" w:cs="Arial"/>
+          <w:sz w:val="28"/>
+          <w:szCs w:val="28"/>
+        </w:rPr>
+        <w:t xml:space="preserve"> </w:t>
+      </w:r>
+      <w:r>
+        <w:rPr>
+          <w:rFonts w:ascii="Arial" w:eastAsia="Arial" w:hAnsi="Arial" w:cs="Arial"/>
+          <w:color w:val="808080"/>
+          <w:sz w:val="28"/>
+          <w:szCs w:val="28"/>
+        </w:rPr>
+        <w:t xml:space="preserve">1</w:t>
       </w:r>
       <w:r>
         <w:rPr>
@@ -1773,24 +2009,126 @@
           <w:sz w:val="28"/>
           <w:szCs w:val="28"/>
         </w:rPr>
-        <w:t xml:space="preserve">A cessão de crédito comprovada por certidão de registro que individualiza o devedor, o contrato e o valor cedido</w:t>
-      </w:r>
-      <w:r>
-        <w:rPr>
-          <w:rFonts w:ascii="Arial" w:eastAsia="Arial" w:hAnsi="Arial" w:cs="Arial"/>
-          <w:sz w:val="28"/>
-          <w:szCs w:val="28"/>
-        </w:rPr>
-        <w:t xml:space="preserve"> é eficaz independentemente da anuência do devedor. A eventual ausência de notificação não torna a dívida inexigível nem impede o cessionário de praticar atos de conservação do crédito</w:t>
-      </w:r>
-      <w:r>
-        <w:rPr>
-          <w:rFonts w:ascii="Arial" w:eastAsia="Arial" w:hAnsi="Arial" w:cs="Arial"/>
-          <w:color w:val="808080"/>
-          <w:sz w:val="28"/>
-          <w:szCs w:val="28"/>
-        </w:rPr>
-        <w:t xml:space="preserve"> (CC 286 e 293)</w:t>
+        <w:t xml:space="preserve">A cessão de crédito comprovada por certidão de registro </w:t>
+      </w:r>
+      <w:r>
+        <w:rPr>
+          <w:rFonts w:ascii="Arial" w:eastAsia="Arial" w:hAnsi="Arial" w:cs="Arial"/>
+          <w:sz w:val="28"/>
+          <w:szCs w:val="28"/>
+        </w:rPr>
+        <w:t xml:space="preserve">é eficaz independentemente da anuência do devedor</w:t>
+      </w:r>
+      <w:r>
+        <w:rPr>
+          <w:rFonts w:ascii="Arial" w:eastAsia="Arial" w:hAnsi="Arial" w:cs="Arial"/>
+          <w:color w:val="808080"/>
+          <w:sz w:val="28"/>
+          <w:szCs w:val="28"/>
+        </w:rPr>
+        <w:t xml:space="preserve">,</w:t>
+      </w:r>
+      <w:r>
+        <w:rPr>
+          <w:rFonts w:ascii="Arial" w:eastAsia="Arial" w:hAnsi="Arial" w:cs="Arial"/>
+          <w:sz w:val="28"/>
+          <w:szCs w:val="28"/>
+        </w:rPr>
+        <w:t xml:space="preserve"> </w:t>
+      </w:r>
+      <w:r>
+        <w:rPr>
+          <w:rFonts w:ascii="Arial" w:eastAsia="Arial" w:hAnsi="Arial" w:cs="Arial"/>
+          <w:color w:val="808080"/>
+          <w:sz w:val="28"/>
+          <w:szCs w:val="28"/>
+        </w:rPr>
+        <w:t xml:space="preserve">e</w:t>
+      </w:r>
+      <w:r>
+        <w:rPr>
+          <w:rFonts w:ascii="Arial" w:eastAsia="Arial" w:hAnsi="Arial" w:cs="Arial"/>
+          <w:sz w:val="28"/>
+          <w:szCs w:val="28"/>
+        </w:rPr>
+        <w:t xml:space="preserve"> </w:t>
+      </w:r>
+      <w:r>
+        <w:rPr>
+          <w:rFonts w:ascii="Arial" w:eastAsia="Arial" w:hAnsi="Arial" w:cs="Arial"/>
+          <w:color w:val="808080"/>
+          <w:sz w:val="28"/>
+          <w:szCs w:val="28"/>
+        </w:rPr>
+        <w:t xml:space="preserve">a</w:t>
+      </w:r>
+      <w:r>
+        <w:rPr>
+          <w:rFonts w:ascii="Arial" w:eastAsia="Arial" w:hAnsi="Arial" w:cs="Arial"/>
+          <w:sz w:val="28"/>
+          <w:szCs w:val="28"/>
+        </w:rPr>
+        <w:t xml:space="preserve"> ausência de notificação não torna a dívida inexigível </w:t>
+      </w:r>
+      <w:r>
+        <w:rPr>
+          <w:rFonts w:ascii="Arial" w:eastAsia="Arial" w:hAnsi="Arial" w:cs="Arial"/>
+          <w:color w:val="808080"/>
+          <w:sz w:val="28"/>
+          <w:szCs w:val="28"/>
+        </w:rPr>
+        <w:t xml:space="preserve">(CC</w:t>
+      </w:r>
+      <w:r>
+        <w:rPr>
+          <w:rFonts w:ascii="Arial" w:eastAsia="Arial" w:hAnsi="Arial" w:cs="Arial"/>
+          <w:sz w:val="28"/>
+          <w:szCs w:val="28"/>
+        </w:rPr>
+        <w:t xml:space="preserve"> </w:t>
+      </w:r>
+      <w:r>
+        <w:rPr>
+          <w:rFonts w:ascii="Arial" w:eastAsia="Arial" w:hAnsi="Arial" w:cs="Arial"/>
+          <w:color w:val="808080"/>
+          <w:sz w:val="28"/>
+          <w:szCs w:val="28"/>
+        </w:rPr>
+        <w:t xml:space="preserve">286</w:t>
+      </w:r>
+      <w:r>
+        <w:rPr>
+          <w:rFonts w:ascii="Arial" w:eastAsia="Arial" w:hAnsi="Arial" w:cs="Arial"/>
+          <w:sz w:val="28"/>
+          <w:szCs w:val="28"/>
+        </w:rPr>
+        <w:t xml:space="preserve"> </w:t>
+      </w:r>
+      <w:r>
+        <w:rPr>
+          <w:rFonts w:ascii="Arial" w:eastAsia="Arial" w:hAnsi="Arial" w:cs="Arial"/>
+          <w:color w:val="808080"/>
+          <w:sz w:val="28"/>
+          <w:szCs w:val="28"/>
+        </w:rPr>
+        <w:t xml:space="preserve">e</w:t>
+      </w:r>
+      <w:r>
+        <w:rPr>
+          <w:rFonts w:ascii="Arial" w:eastAsia="Arial" w:hAnsi="Arial" w:cs="Arial"/>
+          <w:sz w:val="28"/>
+          <w:szCs w:val="28"/>
+        </w:rPr>
+        <w:t xml:space="preserve"> </w:t>
+      </w:r>
+      <w:r>
+        <w:rPr>
+          <w:rFonts w:ascii="Arial" w:eastAsia="Arial" w:hAnsi="Arial" w:cs="Arial"/>
+          <w:color w:val="808080"/>
+          <w:sz w:val="28"/>
+          <w:szCs w:val="28"/>
+        </w:rPr>
+        <w:t xml:space="preserve">293)</w:t>
       </w:r>
       <w:r>
         <w:rPr>
@@ -1826,7 +2164,49 @@
           <w:sz w:val="28"/>
           <w:szCs w:val="28"/>
         </w:rPr>
-        <w:t xml:space="preserve">. Reconhecida a exigibilidade do débito, a cobrança e o registro correspondente constituem exercício regular de direito, o que afasta a falha na prestação do serviço e o dever de indenizar</w:t>
+        <w:t xml:space="preserve">. </w:t>
+      </w:r>
+      <w:r>
+        <w:rPr>
+          <w:rFonts w:ascii="Arial" w:eastAsia="Arial" w:hAnsi="Arial" w:cs="Arial"/>
+          <w:color w:val="808080"/>
+          <w:sz w:val="28"/>
+          <w:szCs w:val="28"/>
+        </w:rPr>
+        <w:t xml:space="preserve">Exigível</w:t>
+      </w:r>
+      <w:r>
+        <w:rPr>
+          <w:rFonts w:ascii="Arial" w:eastAsia="Arial" w:hAnsi="Arial" w:cs="Arial"/>
+          <w:sz w:val="28"/>
+          <w:szCs w:val="28"/>
+        </w:rPr>
+        <w:t xml:space="preserve"> </w:t>
+      </w:r>
+      <w:r>
+        <w:rPr>
+          <w:rFonts w:ascii="Arial" w:eastAsia="Arial" w:hAnsi="Arial" w:cs="Arial"/>
+          <w:color w:val="808080"/>
+          <w:sz w:val="28"/>
+          <w:szCs w:val="28"/>
+        </w:rPr>
+        <w:t xml:space="preserve">o</w:t>
+      </w:r>
+      <w:r>
+        <w:rPr>
+          <w:rFonts w:ascii="Arial" w:eastAsia="Arial" w:hAnsi="Arial" w:cs="Arial"/>
+          <w:sz w:val="28"/>
+          <w:szCs w:val="28"/>
+        </w:rPr>
+        <w:t xml:space="preserve"> débito, a cobrança e o registro</w:t>
+      </w:r>
+      <w:r>
+        <w:rPr>
+          <w:rFonts w:ascii="Arial" w:eastAsia="Arial" w:hAnsi="Arial" w:cs="Arial"/>
+          <w:sz w:val="28"/>
+          <w:szCs w:val="28"/>
+        </w:rPr>
+        <w:t xml:space="preserve"> constituem exercício regular de direito, o que afasta a falha na prestação do serviço e o dever de indenizar</w:t>
       </w:r>
       <w:r>
         <w:rPr>
@@ -5084,7 +5464,50 @@
           <w:sz w:val="28"/>
           <w:szCs w:val="28"/>
         </w:rPr>
-        <w:t xml:space="preserve">incidem as normas do Código de Defesa do Consumidor, com a consequente distribuição do ônus probatório em favor da consumidora; </w:t>
+        <w:t xml:space="preserve">com</w:t>
+      </w:r>
+      <w:r>
+        <w:rPr>
+          <w:rFonts w:ascii="Arial" w:eastAsia="Arial" w:hAnsi="Arial" w:cs="Arial"/>
+          <w:sz w:val="28"/>
+          <w:szCs w:val="28"/>
+        </w:rPr>
+        <w:t xml:space="preserve"> a impugnação da contratação, incumbia ao apelado comprovar a origem e a regularidade do débito</w:t>
+      </w:r>
+      <w:r>
+        <w:rPr>
+          <w:rFonts w:ascii="Arial" w:eastAsia="Arial" w:hAnsi="Arial" w:cs="Arial"/>
+          <w:sz w:val="28"/>
+          <w:szCs w:val="28"/>
+        </w:rPr>
+        <w:t xml:space="preserve">, não </w:t>
+      </w:r>
+      <w:r>
+        <w:rPr>
+          <w:rFonts w:ascii="Arial" w:eastAsia="Arial" w:hAnsi="Arial" w:cs="Arial"/>
+          <w:color w:val="808080"/>
+          <w:sz w:val="28"/>
+          <w:szCs w:val="28"/>
+        </w:rPr>
+        <w:t xml:space="preserve">bastando</w:t>
+      </w:r>
+      <w:r>
+        <w:rPr>
+          <w:rFonts w:ascii="Arial" w:eastAsia="Arial" w:hAnsi="Arial" w:cs="Arial"/>
+          <w:sz w:val="28"/>
+          <w:szCs w:val="28"/>
+        </w:rPr>
+        <w:t xml:space="preserve"> telas sistêmicas, registros unilaterais ou instrumentos de cessão de crédito; </w:t>
+      </w:r>
+      <w:r>
+        <w:rPr>
+          <w:rFonts w:ascii="Arial" w:eastAsia="Arial" w:hAnsi="Arial" w:cs="Arial"/>
+          <w:b/>
+          <w:color w:val="808080"/>
+          <w:sz w:val="28"/>
+          <w:szCs w:val="28"/>
+        </w:rPr>
+        <w:t xml:space="preserve">2</w:t>
       </w:r>
       <w:r>
         <w:rPr>
@@ -5094,15 +5517,49 @@
           <w:sz w:val="28"/>
           <w:szCs w:val="28"/>
         </w:rPr>
-        <w:t xml:space="preserve">2)</w:t>
-      </w:r>
-      <w:r>
-        <w:rPr>
-          <w:rFonts w:ascii="Arial" w:eastAsia="Arial" w:hAnsi="Arial" w:cs="Arial"/>
-          <w:sz w:val="28"/>
-          <w:szCs w:val="28"/>
-        </w:rPr>
-        <w:t xml:space="preserve"> após a impugnação da contratação, incumbia ao apelado comprovar a origem e a regularidade do débito mediante documentação idônea, não sendo suficientes telas sistêmicas, registros unilaterais ou instrumentos de cessão de crédito; </w:t>
+        <w:t xml:space="preserve">)</w:t>
+      </w:r>
+      <w:r>
+        <w:rPr>
+          <w:rFonts w:ascii="Arial" w:eastAsia="Arial" w:hAnsi="Arial" w:cs="Arial"/>
+          <w:sz w:val="28"/>
+          <w:szCs w:val="28"/>
+        </w:rPr>
+        <w:t xml:space="preserve"> a cessão</w:t>
+      </w:r>
+      <w:r>
+        <w:rPr>
+          <w:rFonts w:ascii="Arial" w:eastAsia="Arial" w:hAnsi="Arial" w:cs="Arial"/>
+          <w:sz w:val="28"/>
+          <w:szCs w:val="28"/>
+        </w:rPr>
+        <w:t xml:space="preserve"> não supre a ausência de prova da contratação originária</w:t>
+      </w:r>
+      <w:r>
+        <w:rPr>
+          <w:rFonts w:ascii="Arial" w:eastAsia="Arial" w:hAnsi="Arial" w:cs="Arial"/>
+          <w:sz w:val="28"/>
+          <w:szCs w:val="28"/>
+        </w:rPr>
+        <w:t xml:space="preserve">; e</w:t>
+      </w:r>
+      <w:r>
+        <w:rPr>
+          <w:rFonts w:ascii="Arial" w:eastAsia="Arial" w:hAnsi="Arial" w:cs="Arial"/>
+          <w:sz w:val="28"/>
+          <w:szCs w:val="28"/>
+        </w:rPr>
+        <w:t xml:space="preserve"> </w:t>
+      </w:r>
+      <w:r>
+        <w:rPr>
+          <w:rFonts w:ascii="Arial" w:eastAsia="Arial" w:hAnsi="Arial" w:cs="Arial"/>
+          <w:b/>
+          <w:color w:val="808080"/>
+          <w:sz w:val="28"/>
+          <w:szCs w:val="28"/>
+        </w:rPr>
+        <w:t xml:space="preserve">3</w:t>
       </w:r>
       <w:r>
         <w:rPr>
@@ -5112,33 +5569,7 @@
           <w:sz w:val="28"/>
           <w:szCs w:val="28"/>
         </w:rPr>
-        <w:t xml:space="preserve">3)</w:t>
-      </w:r>
-      <w:r>
-        <w:rPr>
-          <w:rFonts w:ascii="Arial" w:eastAsia="Arial" w:hAnsi="Arial" w:cs="Arial"/>
-          <w:sz w:val="28"/>
-          <w:szCs w:val="28"/>
-        </w:rPr>
-        <w:t xml:space="preserve"> a cessão do crédito não supre a ausência de prova da contratação originária, cabendo à cessionária demonstrar a existência, a titularidade e a exigibilidade da obrigação; e</w:t>
-      </w:r>
-      <w:r>
-        <w:rPr>
-          <w:rFonts w:ascii="Arial" w:eastAsia="Arial" w:hAnsi="Arial" w:cs="Arial"/>
-          <w:sz w:val="28"/>
-          <w:szCs w:val="28"/>
-        </w:rPr>
-        <w:t xml:space="preserve"> </w:t>
-      </w:r>
-      <w:r>
-        <w:rPr>
-          <w:rFonts w:ascii="Arial" w:eastAsia="Arial" w:hAnsi="Arial" w:cs="Arial"/>
-          <w:b/>
-          <w:bCs/>
-          <w:sz w:val="28"/>
-          <w:szCs w:val="28"/>
-        </w:rPr>
-        <w:t xml:space="preserve">4)</w:t>
+        <w:t xml:space="preserve">)</w:t>
       </w:r>
       <w:r>
         <w:rPr>
@@ -5238,7 +5669,41 @@
           <w:sz w:val="28"/>
           <w:szCs w:val="28"/>
         </w:rPr>
-        <w:t xml:space="preserve">A relação jurídica submete-se ao Código de Defesa do Consumidor, mas a inversão do ônus da prova </w:t>
+        <w:t xml:space="preserve">A relação jurídica </w:t>
+      </w:r>
+      <w:r>
+        <w:rPr>
+          <w:rFonts w:ascii="Arial" w:eastAsia="Arial" w:hAnsi="Arial" w:cs="Arial"/>
+          <w:color w:val="808080"/>
+          <w:sz w:val="28"/>
+          <w:szCs w:val="28"/>
+        </w:rPr>
+        <w:t xml:space="preserve">é</w:t>
+      </w:r>
+      <w:r>
+        <w:rPr>
+          <w:rFonts w:ascii="Arial" w:eastAsia="Arial" w:hAnsi="Arial" w:cs="Arial"/>
+          <w:sz w:val="28"/>
+          <w:szCs w:val="28"/>
+        </w:rPr>
+        <w:t xml:space="preserve"> de </w:t>
+      </w:r>
+      <w:r>
+        <w:rPr>
+          <w:rFonts w:ascii="Arial" w:eastAsia="Arial" w:hAnsi="Arial" w:cs="Arial"/>
+          <w:color w:val="808080"/>
+          <w:sz w:val="28"/>
+          <w:szCs w:val="28"/>
+        </w:rPr>
+        <w:t xml:space="preserve">consumo</w:t>
+      </w:r>
+      <w:r>
+        <w:rPr>
+          <w:rFonts w:ascii="Arial" w:eastAsia="Arial" w:hAnsi="Arial" w:cs="Arial"/>
+          <w:sz w:val="28"/>
+          <w:szCs w:val="28"/>
+        </w:rPr>
+        <w:t xml:space="preserve">, mas a inversão do ônus da prova </w:t>
       </w:r>
       <w:r>
         <w:rPr>
@@ -5255,7 +5720,7 @@
           <w:sz w:val="28"/>
           <w:szCs w:val="28"/>
         </w:rPr>
-        <w:t xml:space="preserve"> (CDC 6º VIII)</w:t>
+        <w:t xml:space="preserve"> e foi corretamente afastada, porque a controvérsia é documental e a prova já estava nos autos (CDC 6º VIII)</w:t>
       </w:r>
       <w:r>
         <w:rPr>
@@ -5290,32 +5755,104 @@
         <w:spacing w:after="0" w:line="360" w:lineRule="auto"/>
         <w:ind w:firstLine="2268"/>
         <w:jc w:val="both"/>
-        <w:rPr/>
-      </w:pPr>
-      <w:r>
-        <w:rPr>
-          <w:rFonts w:ascii="Arial" w:eastAsia="Arial" w:hAnsi="Arial" w:cs="Arial"/>
-          <w:sz w:val="28"/>
-          <w:szCs w:val="28"/>
-        </w:rPr>
-        <w:t xml:space="preserve">No caso,</w:t>
-      </w:r>
-      <w:r>
-        <w:rPr>
-          <w:rFonts w:ascii="Arial" w:eastAsia="Arial" w:hAnsi="Arial" w:cs="Arial"/>
-          <w:color w:val="808080"/>
-          <w:sz w:val="28"/>
-          <w:szCs w:val="28"/>
-        </w:rPr>
-        <w:t xml:space="preserve"> a inversão</w:t>
-      </w:r>
-      <w:r>
-        <w:rPr>
-          <w:rFonts w:ascii="Arial" w:eastAsia="Arial" w:hAnsi="Arial" w:cs="Arial"/>
-          <w:sz w:val="28"/>
-          <w:szCs w:val="28"/>
-        </w:rPr>
-        <w:t xml:space="preserve"> foi corretamente afastada, porque a controvérsia é eminentemente documental e a prova já estava nos autos.</w:t>
+      </w:pPr>
+      <w:commentRangeStart w:id="14"/>
+      <w:r>
+        <w:rPr>
+          <w:rFonts w:ascii="Arial" w:eastAsia="Arial" w:hAnsi="Arial" w:cs="Arial"/>
+          <w:color w:val="808080"/>
+          <w:sz w:val="28"/>
+          <w:szCs w:val="28"/>
+        </w:rPr>
+        <w:t xml:space="preserve">De</w:t>
+      </w:r>
+      <w:r>
+        <w:rPr>
+          <w:rFonts w:ascii="Arial" w:eastAsia="Arial" w:hAnsi="Arial" w:cs="Arial"/>
+          <w:sz w:val="28"/>
+          <w:szCs w:val="28"/>
+        </w:rPr>
+        <w:t xml:space="preserve"> </w:t>
+      </w:r>
+      <w:r>
+        <w:rPr>
+          <w:rFonts w:ascii="Arial" w:eastAsia="Arial" w:hAnsi="Arial" w:cs="Arial"/>
+          <w:color w:val="808080"/>
+          <w:sz w:val="28"/>
+          <w:szCs w:val="28"/>
+        </w:rPr>
+        <w:t xml:space="preserve">todo modo</w:t>
+      </w:r>
+      <w:r>
+        <w:rPr>
+          <w:rFonts w:ascii="Arial" w:eastAsia="Arial" w:hAnsi="Arial" w:cs="Arial"/>
+          <w:sz w:val="28"/>
+          <w:szCs w:val="28"/>
+        </w:rPr>
+        <w:t xml:space="preserve">,</w:t>
+      </w:r>
+      <w:r>
+        <w:rPr>
+          <w:rFonts w:ascii="Arial" w:eastAsia="Arial" w:hAnsi="Arial" w:cs="Arial"/>
+          <w:sz w:val="28"/>
+          <w:szCs w:val="28"/>
+          <w:highlight w:val="yellow"/>
+        </w:rPr>
+        <w:t xml:space="preserve"> negada a contratação, cabia ao apelado comprovar </w:t>
+      </w:r>
+      <w:r>
+        <w:rPr>
+          <w:rFonts w:ascii="Arial" w:eastAsia="Arial" w:hAnsi="Arial" w:cs="Arial"/>
+          <w:color w:val="808080"/>
+          <w:sz w:val="28"/>
+          <w:szCs w:val="28"/>
+          <w:highlight w:val="yellow"/>
+        </w:rPr>
+        <w:t xml:space="preserve">o</w:t>
+      </w:r>
+      <w:r>
+        <w:rPr>
+          <w:rFonts w:ascii="Arial" w:eastAsia="Arial" w:hAnsi="Arial" w:cs="Arial"/>
+          <w:sz w:val="28"/>
+          <w:szCs w:val="28"/>
+          <w:highlight w:val="yellow"/>
+        </w:rPr>
+        <w:t xml:space="preserve"> vínculo e a origem do débito, </w:t>
+      </w:r>
+      <w:r>
+        <w:rPr>
+          <w:rFonts w:ascii="Arial" w:eastAsia="Arial" w:hAnsi="Arial" w:cs="Arial"/>
+          <w:sz w:val="28"/>
+          <w:szCs w:val="28"/>
+          <w:highlight w:val="yellow"/>
+        </w:rPr>
+        <w:t xml:space="preserve">e desse ônus se desincumbiu por meio da documentação juntada com a contestação</w:t>
+      </w:r>
+      <w:r>
+        <w:rPr>
+          <w:rFonts w:ascii="Arial" w:eastAsia="Arial" w:hAnsi="Arial" w:cs="Arial"/>
+          <w:color w:val="808080"/>
+          <w:sz w:val="28"/>
+          <w:szCs w:val="28"/>
+          <w:highlight w:val="yellow"/>
+        </w:rPr>
+        <w:t xml:space="preserve"> (CPC 373 II)</w:t>
+      </w:r>
+      <w:r>
+        <w:rPr>
+          <w:rFonts w:ascii="Arial" w:eastAsia="Arial" w:hAnsi="Arial" w:cs="Arial"/>
+          <w:sz w:val="28"/>
+          <w:szCs w:val="28"/>
+          <w:highlight w:val="yellow"/>
+        </w:rPr>
+        <w:t xml:space="preserve">.</w:t>
+      </w:r>
+      <w:commentRangeEnd w:id="14"/>
+      <w:r>
+        <w:rPr>
+          <w:rStyle w:val="CommentReference"/>
+        </w:rPr>
+        <w:commentReference w:id="14"/>
       </w:r>
     </w:p>
     <w:p>
@@ -5323,7 +5860,11 @@
         <w:spacing w:after="0" w:line="360" w:lineRule="auto"/>
         <w:ind w:firstLine="2268"/>
         <w:jc w:val="both"/>
-        <w:rPr/>
+        <w:rPr>
+          <w:rFonts w:ascii="Arial" w:eastAsia="Arial" w:hAnsi="Arial" w:cs="Arial"/>
+          <w:sz w:val="28"/>
+          <w:szCs w:val="28"/>
+        </w:rPr>
       </w:pPr>
     </w:p>
     <w:p>
@@ -5332,67 +5873,180 @@
         <w:ind w:firstLine="2268"/>
         <w:jc w:val="both"/>
       </w:pPr>
-      <w:commentRangeStart w:id="14"/>
-      <w:r>
-        <w:rPr>
-          <w:rFonts w:ascii="Arial" w:eastAsia="Arial" w:hAnsi="Arial" w:cs="Arial"/>
-          <w:color w:val="808080"/>
-          <w:sz w:val="28"/>
-          <w:szCs w:val="28"/>
-        </w:rPr>
-        <w:t xml:space="preserve">Decerto</w:t>
-      </w:r>
-      <w:r>
-        <w:rPr>
-          <w:rFonts w:ascii="Arial" w:eastAsia="Arial" w:hAnsi="Arial" w:cs="Arial"/>
-          <w:sz w:val="28"/>
-          <w:szCs w:val="28"/>
-        </w:rPr>
-        <w:t xml:space="preserve">, </w:t>
-      </w:r>
-      <w:r>
-        <w:rPr>
-          <w:rFonts w:ascii="Arial" w:eastAsia="Arial" w:hAnsi="Arial" w:cs="Arial"/>
-          <w:sz w:val="28"/>
-          <w:szCs w:val="28"/>
-          <w:highlight w:val="yellow"/>
-        </w:rPr>
-        <w:t xml:space="preserve">a inversão não teria efeito prático: negada a contratação, cabia ao apelado comprovar a existência do vínculo e a origem do débito, </w:t>
-      </w:r>
-      <w:r>
-        <w:rPr>
-          <w:rFonts w:ascii="Arial" w:eastAsia="Arial" w:hAnsi="Arial" w:cs="Arial"/>
-          <w:sz w:val="28"/>
-          <w:szCs w:val="28"/>
-          <w:highlight w:val="yellow"/>
-        </w:rPr>
-        <w:t xml:space="preserve">e desse ônus se desincumbiu por meio da documentação juntada com a contestação</w:t>
-      </w:r>
-      <w:r>
-        <w:rPr>
-          <w:rFonts w:ascii="Arial" w:eastAsia="Arial" w:hAnsi="Arial" w:cs="Arial"/>
-          <w:color w:val="808080"/>
-          <w:sz w:val="28"/>
-          <w:szCs w:val="28"/>
-          <w:highlight w:val="yellow"/>
-        </w:rPr>
-        <w:t xml:space="preserve"> (CPC 373 II)</w:t>
-      </w:r>
-      <w:r>
-        <w:rPr>
-          <w:rFonts w:ascii="Arial" w:eastAsia="Arial" w:hAnsi="Arial" w:cs="Arial"/>
-          <w:sz w:val="28"/>
-          <w:szCs w:val="28"/>
-          <w:highlight w:val="yellow"/>
+      <w:commentRangeStart w:id="15"/>
+      <w:r>
+        <w:rPr>
+          <w:rFonts w:ascii="Arial" w:eastAsia="Arial" w:hAnsi="Arial" w:cs="Arial"/>
+          <w:sz w:val="28"/>
+          <w:szCs w:val="28"/>
+        </w:rPr>
+        <w:t xml:space="preserve">O apelado juntou o contrato de venda financiada nº 2112960095016-0, assinado em 10/4/2021, </w:t>
+      </w:r>
+      <w:r>
+        <w:rPr>
+          <w:rFonts w:ascii="Arial" w:eastAsia="Arial" w:hAnsi="Arial" w:cs="Arial"/>
+          <w:color w:val="808080"/>
+          <w:sz w:val="28"/>
+          <w:szCs w:val="28"/>
+        </w:rPr>
+        <w:t xml:space="preserve">com</w:t>
+      </w:r>
+      <w:r>
+        <w:rPr>
+          <w:rFonts w:ascii="Arial" w:eastAsia="Arial" w:hAnsi="Arial" w:cs="Arial"/>
+          <w:sz w:val="28"/>
+          <w:szCs w:val="28"/>
+        </w:rPr>
+        <w:t xml:space="preserve"> os dados pessoais </w:t>
+      </w:r>
+      <w:r>
+        <w:rPr>
+          <w:rFonts w:ascii="Arial" w:eastAsia="Arial" w:hAnsi="Arial" w:cs="Arial"/>
+          <w:sz w:val="28"/>
+          <w:szCs w:val="28"/>
+        </w:rPr>
+        <w:t xml:space="preserve">e o </w:t>
+      </w:r>
+      <w:r>
+        <w:rPr>
+          <w:rFonts w:ascii="Arial" w:eastAsia="Arial" w:hAnsi="Arial" w:cs="Arial"/>
+          <w:sz w:val="28"/>
+          <w:szCs w:val="28"/>
+        </w:rPr>
+        <w:t xml:space="preserve">endereço </w:t>
+      </w:r>
+      <w:r>
+        <w:rPr>
+          <w:rFonts w:ascii="Arial" w:eastAsia="Arial" w:hAnsi="Arial" w:cs="Arial"/>
+          <w:color w:val="808080"/>
+          <w:sz w:val="28"/>
+          <w:szCs w:val="28"/>
+        </w:rPr>
+        <w:t xml:space="preserve">da</w:t>
+      </w:r>
+      <w:r>
+        <w:rPr>
+          <w:rFonts w:ascii="Arial" w:eastAsia="Arial" w:hAnsi="Arial" w:cs="Arial"/>
+          <w:sz w:val="28"/>
+          <w:szCs w:val="28"/>
+        </w:rPr>
+        <w:t xml:space="preserve"> </w:t>
+      </w:r>
+      <w:r>
+        <w:rPr>
+          <w:rFonts w:ascii="Arial" w:eastAsia="Arial" w:hAnsi="Arial" w:cs="Arial"/>
+          <w:color w:val="808080"/>
+          <w:sz w:val="28"/>
+          <w:szCs w:val="28"/>
+        </w:rPr>
+        <w:t xml:space="preserve">apelante, constantes do</w:t>
+      </w:r>
+      <w:r>
+        <w:rPr>
+          <w:rFonts w:ascii="Arial" w:eastAsia="Arial" w:hAnsi="Arial" w:cs="Arial"/>
+          <w:sz w:val="28"/>
+          <w:szCs w:val="28"/>
+        </w:rPr>
+        <w:t xml:space="preserve"> comprovante de residência</w:t>
+      </w:r>
+      <w:r>
+        <w:rPr>
+          <w:rFonts w:ascii="Arial" w:eastAsia="Arial" w:hAnsi="Arial" w:cs="Arial"/>
+          <w:color w:val="808080"/>
+          <w:sz w:val="28"/>
+          <w:szCs w:val="28"/>
+        </w:rPr>
+        <w:t xml:space="preserve">,</w:t>
+      </w:r>
+      <w:r>
+        <w:rPr>
+          <w:rFonts w:ascii="Arial" w:eastAsia="Arial" w:hAnsi="Arial" w:cs="Arial"/>
+          <w:sz w:val="28"/>
+          <w:szCs w:val="28"/>
+        </w:rPr>
+        <w:t xml:space="preserve"> e</w:t>
+      </w:r>
+      <w:r>
+        <w:rPr>
+          <w:rFonts w:ascii="Arial" w:eastAsia="Arial" w:hAnsi="Arial" w:cs="Arial"/>
+          <w:sz w:val="28"/>
+          <w:szCs w:val="28"/>
+        </w:rPr>
+        <w:t xml:space="preserve"> documento de identificação </w:t>
+      </w:r>
+      <w:r>
+        <w:rPr>
+          <w:rFonts w:ascii="Arial" w:eastAsia="Arial" w:hAnsi="Arial" w:cs="Arial"/>
+          <w:sz w:val="28"/>
+          <w:szCs w:val="28"/>
+        </w:rPr>
+        <w:t xml:space="preserve">idêntico ao </w:t>
+      </w:r>
+      <w:r>
+        <w:rPr>
+          <w:rFonts w:ascii="Arial" w:eastAsia="Arial" w:hAnsi="Arial" w:cs="Arial"/>
+          <w:color w:val="808080"/>
+          <w:sz w:val="28"/>
+          <w:szCs w:val="28"/>
+        </w:rPr>
+        <w:t xml:space="preserve">da</w:t>
+      </w:r>
+      <w:r>
+        <w:rPr>
+          <w:rFonts w:ascii="Arial" w:eastAsia="Arial" w:hAnsi="Arial" w:cs="Arial"/>
+          <w:sz w:val="28"/>
+          <w:szCs w:val="28"/>
+        </w:rPr>
+        <w:t xml:space="preserve"> </w:t>
+      </w:r>
+      <w:r>
+        <w:rPr>
+          <w:rFonts w:ascii="Arial" w:eastAsia="Arial" w:hAnsi="Arial" w:cs="Arial"/>
+          <w:color w:val="808080"/>
+          <w:sz w:val="28"/>
+          <w:szCs w:val="28"/>
+        </w:rPr>
+        <w:t xml:space="preserve">inicial</w:t>
+      </w:r>
+      <w:r>
+        <w:rPr>
+          <w:rFonts w:ascii="Arial" w:eastAsia="Arial" w:hAnsi="Arial" w:cs="Arial"/>
+          <w:sz w:val="28"/>
+          <w:szCs w:val="28"/>
+        </w:rPr>
+        <w:t xml:space="preserve"> (</w:t>
+      </w:r>
+      <w:r>
+        <w:rPr>
+          <w:rFonts w:ascii="Arial" w:eastAsia="Arial" w:hAnsi="Arial" w:cs="Arial"/>
+          <w:color w:val="808080"/>
+          <w:sz w:val="28"/>
+          <w:szCs w:val="28"/>
+        </w:rPr>
+        <w:t xml:space="preserve">ID 89866219, ID 89865953 e </w:t>
+      </w:r>
+      <w:r>
+        <w:rPr>
+          <w:rFonts w:ascii="Arial" w:eastAsia="Arial" w:hAnsi="Arial" w:cs="Arial"/>
+          <w:sz w:val="28"/>
+          <w:szCs w:val="28"/>
+        </w:rPr>
+        <w:t xml:space="preserve">ID 89865947)</w:t>
+      </w:r>
+      <w:r>
+        <w:rPr>
+          <w:rFonts w:ascii="Arial" w:eastAsia="Arial" w:hAnsi="Arial" w:cs="Arial"/>
+          <w:sz w:val="28"/>
+          <w:szCs w:val="28"/>
         </w:rPr>
         <w:t xml:space="preserve">.</w:t>
       </w:r>
-      <w:commentRangeEnd w:id="14"/>
+      <w:commentRangeEnd w:id="15"/>
       <w:r>
         <w:rPr>
           <w:rStyle w:val="CommentReference"/>
         </w:rPr>
-        <w:commentReference w:id="14"/>
+        <w:commentReference w:id="15"/>
       </w:r>
     </w:p>
     <w:p>
@@ -5417,18 +6071,70 @@
       <w:r>
         <w:rPr>
           <w:rFonts w:ascii="Arial" w:eastAsia="Arial" w:hAnsi="Arial" w:cs="Arial"/>
-          <w:sz w:val="28"/>
-          <w:szCs w:val="28"/>
-        </w:rPr>
-        <w:t xml:space="preserve">O apelado juntou o contrato de venda financiada nº 2112960095016-0, assinado em 10/4/2021, a ficha de aprovação de crédito e o demonstrativo do custo efetivo total</w:t>
-      </w:r>
-      <w:r>
-        <w:rPr>
-          <w:rFonts w:ascii="Arial" w:eastAsia="Arial" w:hAnsi="Arial" w:cs="Arial"/>
-          <w:sz w:val="28"/>
-          <w:szCs w:val="28"/>
-        </w:rPr>
-        <w:t xml:space="preserve"> (ID 89866219)</w:t>
+          <w:color w:val="808080"/>
+          <w:sz w:val="28"/>
+          <w:szCs w:val="28"/>
+        </w:rPr>
+        <w:t xml:space="preserve">O contrato assinado consta dos autos</w:t>
+      </w:r>
+      <w:r>
+        <w:rPr>
+          <w:rFonts w:ascii="Arial" w:eastAsia="Arial" w:hAnsi="Arial" w:cs="Arial"/>
+          <w:sz w:val="28"/>
+          <w:szCs w:val="28"/>
+        </w:rPr>
+        <w:t xml:space="preserve">, </w:t>
+      </w:r>
+      <w:r>
+        <w:rPr>
+          <w:rFonts w:ascii="Arial" w:eastAsia="Arial" w:hAnsi="Arial" w:cs="Arial"/>
+          <w:color w:val="808080"/>
+          <w:sz w:val="28"/>
+          <w:szCs w:val="28"/>
+        </w:rPr>
+        <w:t xml:space="preserve">o</w:t>
+      </w:r>
+      <w:r>
+        <w:rPr>
+          <w:rFonts w:ascii="Arial" w:eastAsia="Arial" w:hAnsi="Arial" w:cs="Arial"/>
+          <w:sz w:val="28"/>
+          <w:szCs w:val="28"/>
+        </w:rPr>
+        <w:t xml:space="preserve"> </w:t>
+      </w:r>
+      <w:r>
+        <w:rPr>
+          <w:rFonts w:ascii="Arial" w:eastAsia="Arial" w:hAnsi="Arial" w:cs="Arial"/>
+          <w:color w:val="808080"/>
+          <w:sz w:val="28"/>
+          <w:szCs w:val="28"/>
+        </w:rPr>
+        <w:t xml:space="preserve">que afasta</w:t>
+      </w:r>
+      <w:r>
+        <w:rPr>
+          <w:rFonts w:ascii="Arial" w:eastAsia="Arial" w:hAnsi="Arial" w:cs="Arial"/>
+          <w:sz w:val="28"/>
+          <w:szCs w:val="28"/>
+        </w:rPr>
+        <w:t xml:space="preserve"> a </w:t>
+      </w:r>
+      <w:r>
+        <w:rPr>
+          <w:rFonts w:ascii="Arial" w:eastAsia="Arial" w:hAnsi="Arial" w:cs="Arial"/>
+          <w:color w:val="808080"/>
+          <w:sz w:val="28"/>
+          <w:szCs w:val="28"/>
+        </w:rPr>
+        <w:t xml:space="preserve">alegação</w:t>
+      </w:r>
+      <w:r>
+        <w:rPr>
+          <w:rFonts w:ascii="Arial" w:eastAsia="Arial" w:hAnsi="Arial" w:cs="Arial"/>
+          <w:sz w:val="28"/>
+          <w:szCs w:val="28"/>
+        </w:rPr>
+        <w:t xml:space="preserve"> de que a defesa se apoiou apenas em telas sistêmicas</w:t>
       </w:r>
       <w:r>
         <w:rPr>
@@ -5459,8 +6165,27 @@
           <w:rFonts w:ascii="Arial" w:eastAsia="Arial" w:hAnsi="Arial" w:cs="Arial"/>
           <w:sz w:val="28"/>
           <w:szCs w:val="28"/>
-        </w:rPr>
-        <w:t xml:space="preserve">O instrumento contém os dados pessoais da apelante e o mesmo endereço indicado no comprovante de residência e na procuração que acompanham a inicial.</w:t>
+          <w:highlight w:val="yellow"/>
+        </w:rPr>
+        <w:t xml:space="preserve">A</w:t>
+      </w:r>
+      <w:r>
+        <w:rPr>
+          <w:rFonts w:ascii="Arial" w:eastAsia="Arial" w:hAnsi="Arial" w:cs="Arial"/>
+          <w:sz w:val="28"/>
+          <w:szCs w:val="28"/>
+          <w:highlight w:val="yellow"/>
+        </w:rPr>
+        <w:t xml:space="preserve"> apelante não impugnou especificamente </w:t>
+      </w:r>
+      <w:r>
+        <w:rPr>
+          <w:rFonts w:ascii="Arial" w:eastAsia="Arial" w:hAnsi="Arial" w:cs="Arial"/>
+          <w:sz w:val="28"/>
+          <w:szCs w:val="28"/>
+          <w:highlight w:val="yellow"/>
+        </w:rPr>
+        <w:t xml:space="preserve">a autenticidade da assinatura lançada no contrato, limitando-se a contestar genericamente os documentos apresentados.</w:t>
       </w:r>
     </w:p>
     <w:p>
@@ -5476,411 +6201,165 @@
         <w:spacing w:after="0" w:line="360" w:lineRule="auto"/>
         <w:ind w:firstLine="2268"/>
         <w:jc w:val="both"/>
-        <w:rPr/>
-      </w:pPr>
-      <w:commentRangeStart w:id="15"/>
-      <w:r>
-        <w:rPr>
-          <w:rFonts w:ascii="Arial" w:eastAsia="Arial" w:hAnsi="Arial" w:cs="Arial"/>
-          <w:sz w:val="28"/>
-          <w:szCs w:val="28"/>
-        </w:rPr>
-        <w:t xml:space="preserve">O documento de identificação apresentado pelo credor é idêntico ao juntado pela própria autora</w:t>
-      </w:r>
-      <w:r>
-        <w:rPr>
-          <w:rFonts w:ascii="Arial" w:eastAsia="Arial" w:hAnsi="Arial" w:cs="Arial"/>
-          <w:sz w:val="28"/>
-          <w:szCs w:val="28"/>
-        </w:rPr>
-        <w:t xml:space="preserve"> (ID 89865947)</w:t>
-      </w:r>
-      <w:r>
-        <w:rPr>
-          <w:rFonts w:ascii="Arial" w:eastAsia="Arial" w:hAnsi="Arial" w:cs="Arial"/>
-          <w:sz w:val="28"/>
-          <w:szCs w:val="28"/>
-        </w:rPr>
-        <w:t xml:space="preserve">.</w:t>
-      </w:r>
-      <w:commentRangeEnd w:id="15"/>
+        <w:rPr>
+          <w:rFonts w:ascii="Arial" w:eastAsia="Arial" w:hAnsi="Arial" w:cs="Arial"/>
+          <w:sz w:val="28"/>
+          <w:szCs w:val="28"/>
+        </w:rPr>
+      </w:pPr>
+      <w:commentRangeStart w:id="16"/>
+      <w:r>
+        <w:rPr>
+          <w:rFonts w:ascii="Arial" w:eastAsia="Arial" w:hAnsi="Arial" w:cs="Arial"/>
+          <w:color w:val="808080"/>
+          <w:sz w:val="28"/>
+          <w:szCs w:val="28"/>
+        </w:rPr>
+        <w:t xml:space="preserve">O</w:t>
+      </w:r>
+      <w:r>
+        <w:rPr>
+          <w:rFonts w:ascii="Arial" w:eastAsia="Arial" w:hAnsi="Arial" w:cs="Arial"/>
+          <w:sz w:val="28"/>
+          <w:szCs w:val="28"/>
+        </w:rPr>
+        <w:t xml:space="preserve"> </w:t>
+      </w:r>
+      <w:r>
+        <w:rPr>
+          <w:rFonts w:ascii="Arial" w:eastAsia="Arial" w:hAnsi="Arial" w:cs="Arial"/>
+          <w:color w:val="808080"/>
+          <w:sz w:val="28"/>
+          <w:szCs w:val="28"/>
+        </w:rPr>
+        <w:t xml:space="preserve">Tema</w:t>
+      </w:r>
+      <w:r>
+        <w:rPr>
+          <w:rFonts w:ascii="Arial" w:eastAsia="Arial" w:hAnsi="Arial" w:cs="Arial"/>
+          <w:sz w:val="28"/>
+          <w:szCs w:val="28"/>
+        </w:rPr>
+        <w:t xml:space="preserve"> </w:t>
+      </w:r>
+      <w:r>
+        <w:rPr>
+          <w:rFonts w:ascii="Arial" w:eastAsia="Arial" w:hAnsi="Arial" w:cs="Arial"/>
+          <w:color w:val="808080"/>
+          <w:sz w:val="28"/>
+          <w:szCs w:val="28"/>
+        </w:rPr>
+        <w:t xml:space="preserve">1.061/STJ</w:t>
+      </w:r>
+      <w:r>
+        <w:rPr>
+          <w:rFonts w:ascii="Arial" w:eastAsia="Arial" w:hAnsi="Arial" w:cs="Arial"/>
+          <w:sz w:val="28"/>
+          <w:szCs w:val="28"/>
+        </w:rPr>
+        <w:t xml:space="preserve">, </w:t>
+      </w:r>
+      <w:r>
+        <w:rPr>
+          <w:rFonts w:ascii="Arial" w:eastAsia="Arial" w:hAnsi="Arial" w:cs="Arial"/>
+          <w:color w:val="808080"/>
+          <w:sz w:val="28"/>
+          <w:szCs w:val="28"/>
+        </w:rPr>
+        <w:t xml:space="preserve">invocado</w:t>
+      </w:r>
+      <w:r>
+        <w:rPr>
+          <w:rFonts w:ascii="Arial" w:eastAsia="Arial" w:hAnsi="Arial" w:cs="Arial"/>
+          <w:sz w:val="28"/>
+          <w:szCs w:val="28"/>
+        </w:rPr>
+        <w:t xml:space="preserve"> </w:t>
+      </w:r>
+      <w:r>
+        <w:rPr>
+          <w:rFonts w:ascii="Arial" w:eastAsia="Arial" w:hAnsi="Arial" w:cs="Arial"/>
+          <w:color w:val="808080"/>
+          <w:sz w:val="28"/>
+          <w:szCs w:val="28"/>
+        </w:rPr>
+        <w:t xml:space="preserve">no</w:t>
+      </w:r>
+      <w:r>
+        <w:rPr>
+          <w:rFonts w:ascii="Arial" w:eastAsia="Arial" w:hAnsi="Arial" w:cs="Arial"/>
+          <w:sz w:val="28"/>
+          <w:szCs w:val="28"/>
+        </w:rPr>
+        <w:t xml:space="preserve"> </w:t>
+      </w:r>
+      <w:r>
+        <w:rPr>
+          <w:rFonts w:ascii="Arial" w:eastAsia="Arial" w:hAnsi="Arial" w:cs="Arial"/>
+          <w:color w:val="808080"/>
+          <w:sz w:val="28"/>
+          <w:szCs w:val="28"/>
+        </w:rPr>
+        <w:t xml:space="preserve">apelo,</w:t>
+      </w:r>
+      <w:r>
+        <w:rPr>
+          <w:rFonts w:ascii="Arial" w:eastAsia="Arial" w:hAnsi="Arial" w:cs="Arial"/>
+          <w:sz w:val="28"/>
+          <w:szCs w:val="28"/>
+        </w:rPr>
+        <w:t xml:space="preserve"> </w:t>
+      </w:r>
+      <w:r>
+        <w:rPr>
+          <w:rFonts w:ascii="Arial" w:eastAsia="Arial" w:hAnsi="Arial" w:cs="Arial"/>
+          <w:color w:val="808080"/>
+          <w:sz w:val="28"/>
+          <w:szCs w:val="28"/>
+        </w:rPr>
+        <w:t xml:space="preserve">fixou</w:t>
+      </w:r>
+      <w:r>
+        <w:rPr>
+          <w:rFonts w:ascii="Arial" w:eastAsia="Arial" w:hAnsi="Arial" w:cs="Arial"/>
+          <w:sz w:val="28"/>
+          <w:szCs w:val="28"/>
+        </w:rPr>
+        <w:t xml:space="preserve"> a </w:t>
+      </w:r>
+      <w:r>
+        <w:rPr>
+          <w:rFonts w:ascii="Arial" w:eastAsia="Arial" w:hAnsi="Arial" w:cs="Arial"/>
+          <w:color w:val="808080"/>
+          <w:sz w:val="28"/>
+          <w:szCs w:val="28"/>
+        </w:rPr>
+        <w:t xml:space="preserve">seguinte</w:t>
+      </w:r>
+      <w:r>
+        <w:rPr>
+          <w:rFonts w:ascii="Arial" w:eastAsia="Arial" w:hAnsi="Arial" w:cs="Arial"/>
+          <w:sz w:val="28"/>
+          <w:szCs w:val="28"/>
+        </w:rPr>
+        <w:t xml:space="preserve"> </w:t>
+      </w:r>
+      <w:r>
+        <w:rPr>
+          <w:rFonts w:ascii="Arial" w:eastAsia="Arial" w:hAnsi="Arial" w:cs="Arial"/>
+          <w:color w:val="808080"/>
+          <w:sz w:val="28"/>
+          <w:szCs w:val="28"/>
+        </w:rPr>
+        <w:t xml:space="preserve">tese:</w:t>
+      </w:r>
+      <w:commentRangeEnd w:id="16"/>
       <w:r>
         <w:rPr>
           <w:rStyle w:val="CommentReference"/>
-        </w:rPr>
-        <w:commentReference w:id="15"/>
-      </w:r>
-    </w:p>
-    <w:p>
-      <w:pPr>
-        <w:spacing w:after="0" w:line="360" w:lineRule="auto"/>
-        <w:ind w:firstLine="2268"/>
-        <w:jc w:val="both"/>
-        <w:rPr/>
-      </w:pPr>
-    </w:p>
-    <w:p>
-      <w:pPr>
-        <w:spacing w:after="0" w:line="360" w:lineRule="auto"/>
-        <w:ind w:firstLine="2268"/>
-        <w:jc w:val="both"/>
-        <w:rPr/>
-      </w:pPr>
-      <w:commentRangeStart w:id="16"/>
-      <w:r>
-        <w:rPr>
-          <w:rFonts w:ascii="Arial" w:eastAsia="Arial" w:hAnsi="Arial" w:cs="Arial"/>
-          <w:color w:val="808080"/>
-          <w:sz w:val="28"/>
-          <w:szCs w:val="28"/>
-        </w:rPr>
-        <w:t xml:space="preserve">A r. sentença registrou, ainda, a aquisição, em 10/4/2021, de aparelho telefônico e de chip de telefonia móvel vinculados ao contrato, bem como o registro de pagamentos posteriores (ID 89866233).</w:t>
-      </w:r>
-      <w:commentRangeEnd w:id="16"/>
-      <w:r>
-        <w:rPr>
-          <w:rStyle w:val="CommentReference"/>
           <w:color w:val="808080"/>
         </w:rPr>
         <w:commentReference w:id="16"/>
-      </w:r>
-    </w:p>
-    <w:p>
-      <w:pPr>
-        <w:spacing w:after="0" w:line="360" w:lineRule="auto"/>
-        <w:ind w:firstLine="2268"/>
-        <w:jc w:val="both"/>
-        <w:rPr>
-          <w:rFonts w:ascii="Arial" w:eastAsia="Arial" w:hAnsi="Arial" w:cs="Arial"/>
-          <w:sz w:val="28"/>
-          <w:szCs w:val="28"/>
-        </w:rPr>
-      </w:pPr>
-    </w:p>
-    <w:p>
-      <w:pPr>
-        <w:spacing w:after="0" w:line="360" w:lineRule="auto"/>
-        <w:ind w:firstLine="2268"/>
-        <w:jc w:val="both"/>
-        <w:rPr/>
-      </w:pPr>
-      <w:r>
-        <w:rPr>
-          <w:rFonts w:ascii="Arial" w:eastAsia="Arial" w:hAnsi="Arial" w:cs="Arial"/>
-          <w:sz w:val="28"/>
-          <w:szCs w:val="28"/>
-        </w:rPr>
-        <w:t xml:space="preserve">Assim, n</w:t>
-      </w:r>
-      <w:r>
-        <w:rPr>
-          <w:rFonts w:ascii="Arial" w:eastAsia="Arial" w:hAnsi="Arial" w:cs="Arial"/>
-          <w:sz w:val="28"/>
-          <w:szCs w:val="28"/>
-        </w:rPr>
-        <w:t xml:space="preserve">ão procede a afirmação de que a defesa se apoiou apenas em telas sistêmicas ou registros unilaterais. O contrato assinado consta dos autos e foi expressamente examinado na sentença.</w:t>
-      </w:r>
-    </w:p>
-    <w:p>
-      <w:pPr>
-        <w:spacing w:after="0" w:line="360" w:lineRule="auto"/>
-        <w:ind w:firstLine="2268"/>
-        <w:jc w:val="both"/>
-        <w:rPr/>
-      </w:pPr>
-    </w:p>
-    <w:p>
-      <w:pPr>
-        <w:spacing w:after="0" w:line="360" w:lineRule="auto"/>
-        <w:ind w:firstLine="2268"/>
-        <w:jc w:val="both"/>
-        <w:rPr/>
-      </w:pPr>
-      <w:r>
-        <w:rPr>
-          <w:rFonts w:ascii="Arial" w:eastAsia="Arial" w:hAnsi="Arial" w:cs="Arial"/>
-          <w:sz w:val="28"/>
-          <w:szCs w:val="28"/>
-          <w:highlight w:val="yellow"/>
-        </w:rPr>
-        <w:t xml:space="preserve">A</w:t>
-      </w:r>
-      <w:r>
-        <w:rPr>
-          <w:rFonts w:ascii="Arial" w:eastAsia="Arial" w:hAnsi="Arial" w:cs="Arial"/>
-          <w:sz w:val="28"/>
-          <w:szCs w:val="28"/>
-          <w:highlight w:val="yellow"/>
-        </w:rPr>
-        <w:t xml:space="preserve"> apelante não impugnou especificamente </w:t>
-      </w:r>
-      <w:r>
-        <w:rPr>
-          <w:rFonts w:ascii="Arial" w:eastAsia="Arial" w:hAnsi="Arial" w:cs="Arial"/>
-          <w:sz w:val="28"/>
-          <w:szCs w:val="28"/>
-          <w:highlight w:val="yellow"/>
-        </w:rPr>
-        <w:t xml:space="preserve">a autenticidade da assinatura lançada no contrato, limitando-se a contestar genericamente os documentos apresentados.</w:t>
-      </w:r>
-    </w:p>
-    <w:p>
-      <w:pPr>
-        <w:spacing w:after="0" w:line="360" w:lineRule="auto"/>
-        <w:ind w:firstLine="2268"/>
-        <w:jc w:val="both"/>
-        <w:rPr/>
-      </w:pPr>
-    </w:p>
-    <w:p>
-      <w:pPr>
-        <w:spacing w:after="0" w:line="360" w:lineRule="auto"/>
-        <w:ind w:firstLine="2268"/>
-        <w:jc w:val="both"/>
-        <w:rPr>
-          <w:rFonts w:ascii="Arial" w:eastAsia="Arial" w:hAnsi="Arial" w:cs="Arial"/>
-          <w:sz w:val="28"/>
-          <w:szCs w:val="28"/>
-        </w:rPr>
-      </w:pPr>
-      <w:commentRangeStart w:id="17"/>
-      <w:r>
-        <w:rPr>
-          <w:rFonts w:ascii="Arial" w:eastAsia="Arial" w:hAnsi="Arial" w:cs="Arial"/>
-          <w:color w:val="808080"/>
-          <w:sz w:val="28"/>
-          <w:szCs w:val="28"/>
-        </w:rPr>
-        <w:t xml:space="preserve">O</w:t>
-      </w:r>
-      <w:r>
-        <w:rPr>
-          <w:rFonts w:ascii="Arial" w:eastAsia="Arial" w:hAnsi="Arial" w:cs="Arial"/>
-          <w:sz w:val="28"/>
-          <w:szCs w:val="28"/>
-        </w:rPr>
-        <w:t xml:space="preserve"> </w:t>
-      </w:r>
-      <w:r>
-        <w:rPr>
-          <w:rFonts w:ascii="Arial" w:eastAsia="Arial" w:hAnsi="Arial" w:cs="Arial"/>
-          <w:color w:val="808080"/>
-          <w:sz w:val="28"/>
-          <w:szCs w:val="28"/>
-        </w:rPr>
-        <w:t xml:space="preserve">c.</w:t>
-      </w:r>
-      <w:r>
-        <w:rPr>
-          <w:rFonts w:ascii="Arial" w:eastAsia="Arial" w:hAnsi="Arial" w:cs="Arial"/>
-          <w:sz w:val="28"/>
-          <w:szCs w:val="28"/>
-        </w:rPr>
-        <w:t xml:space="preserve"> </w:t>
-      </w:r>
-      <w:r>
-        <w:rPr>
-          <w:rFonts w:ascii="Arial" w:eastAsia="Arial" w:hAnsi="Arial" w:cs="Arial"/>
-          <w:color w:val="808080"/>
-          <w:sz w:val="28"/>
-          <w:szCs w:val="28"/>
-        </w:rPr>
-        <w:t xml:space="preserve">STJ</w:t>
-      </w:r>
-      <w:r>
-        <w:rPr>
-          <w:rFonts w:ascii="Arial" w:eastAsia="Arial" w:hAnsi="Arial" w:cs="Arial"/>
-          <w:sz w:val="28"/>
-          <w:szCs w:val="28"/>
-        </w:rPr>
-        <w:t xml:space="preserve">, </w:t>
-      </w:r>
-      <w:r>
-        <w:rPr>
-          <w:rFonts w:ascii="Arial" w:eastAsia="Arial" w:hAnsi="Arial" w:cs="Arial"/>
-          <w:color w:val="808080"/>
-          <w:sz w:val="28"/>
-          <w:szCs w:val="28"/>
-        </w:rPr>
-        <w:t xml:space="preserve">no</w:t>
-      </w:r>
-      <w:r>
-        <w:rPr>
-          <w:rFonts w:ascii="Arial" w:eastAsia="Arial" w:hAnsi="Arial" w:cs="Arial"/>
-          <w:sz w:val="28"/>
-          <w:szCs w:val="28"/>
-        </w:rPr>
-        <w:t xml:space="preserve"> </w:t>
-      </w:r>
-      <w:r>
-        <w:rPr>
-          <w:rFonts w:ascii="Arial" w:eastAsia="Arial" w:hAnsi="Arial" w:cs="Arial"/>
-          <w:color w:val="808080"/>
-          <w:sz w:val="28"/>
-          <w:szCs w:val="28"/>
-        </w:rPr>
-        <w:t xml:space="preserve">julgamento</w:t>
-      </w:r>
-      <w:r>
-        <w:rPr>
-          <w:rFonts w:ascii="Arial" w:eastAsia="Arial" w:hAnsi="Arial" w:cs="Arial"/>
-          <w:sz w:val="28"/>
-          <w:szCs w:val="28"/>
-        </w:rPr>
-        <w:t xml:space="preserve"> </w:t>
-      </w:r>
-      <w:r>
-        <w:rPr>
-          <w:rFonts w:ascii="Arial" w:eastAsia="Arial" w:hAnsi="Arial" w:cs="Arial"/>
-          <w:color w:val="808080"/>
-          <w:sz w:val="28"/>
-          <w:szCs w:val="28"/>
-        </w:rPr>
-        <w:t xml:space="preserve">do</w:t>
-      </w:r>
-      <w:r>
-        <w:rPr>
-          <w:rFonts w:ascii="Arial" w:eastAsia="Arial" w:hAnsi="Arial" w:cs="Arial"/>
-          <w:sz w:val="28"/>
-          <w:szCs w:val="28"/>
-        </w:rPr>
-        <w:t xml:space="preserve"> </w:t>
-      </w:r>
-      <w:r>
-        <w:rPr>
-          <w:rFonts w:ascii="Arial" w:eastAsia="Arial" w:hAnsi="Arial" w:cs="Arial"/>
-          <w:color w:val="808080"/>
-          <w:sz w:val="28"/>
-          <w:szCs w:val="28"/>
-        </w:rPr>
-        <w:t xml:space="preserve">Tema</w:t>
-      </w:r>
-      <w:r>
-        <w:rPr>
-          <w:rFonts w:ascii="Arial" w:eastAsia="Arial" w:hAnsi="Arial" w:cs="Arial"/>
-          <w:sz w:val="28"/>
-          <w:szCs w:val="28"/>
-        </w:rPr>
-        <w:t xml:space="preserve"> </w:t>
-      </w:r>
-      <w:r>
-        <w:rPr>
-          <w:rFonts w:ascii="Arial" w:eastAsia="Arial" w:hAnsi="Arial" w:cs="Arial"/>
-          <w:color w:val="808080"/>
-          <w:sz w:val="28"/>
-          <w:szCs w:val="28"/>
-        </w:rPr>
-        <w:t xml:space="preserve">Repetitivo</w:t>
-      </w:r>
-      <w:r>
-        <w:rPr>
-          <w:rFonts w:ascii="Arial" w:eastAsia="Arial" w:hAnsi="Arial" w:cs="Arial"/>
-          <w:sz w:val="28"/>
-          <w:szCs w:val="28"/>
-        </w:rPr>
-        <w:t xml:space="preserve"> </w:t>
-      </w:r>
-      <w:r>
-        <w:rPr>
-          <w:rFonts w:ascii="Arial" w:eastAsia="Arial" w:hAnsi="Arial" w:cs="Arial"/>
-          <w:color w:val="808080"/>
-          <w:sz w:val="28"/>
-          <w:szCs w:val="28"/>
-        </w:rPr>
-        <w:t xml:space="preserve">1.061,</w:t>
-      </w:r>
-      <w:r>
-        <w:rPr>
-          <w:rFonts w:ascii="Arial" w:eastAsia="Arial" w:hAnsi="Arial" w:cs="Arial"/>
-          <w:sz w:val="28"/>
-          <w:szCs w:val="28"/>
-        </w:rPr>
-        <w:t xml:space="preserve"> </w:t>
-      </w:r>
-      <w:r>
-        <w:rPr>
-          <w:rFonts w:ascii="Arial" w:eastAsia="Arial" w:hAnsi="Arial" w:cs="Arial"/>
-          <w:color w:val="808080"/>
-          <w:sz w:val="28"/>
-          <w:szCs w:val="28"/>
-        </w:rPr>
-        <w:t xml:space="preserve">invocado</w:t>
-      </w:r>
-      <w:r>
-        <w:rPr>
-          <w:rFonts w:ascii="Arial" w:eastAsia="Arial" w:hAnsi="Arial" w:cs="Arial"/>
-          <w:sz w:val="28"/>
-          <w:szCs w:val="28"/>
-        </w:rPr>
-        <w:t xml:space="preserve"> </w:t>
-      </w:r>
-      <w:r>
-        <w:rPr>
-          <w:rFonts w:ascii="Arial" w:eastAsia="Arial" w:hAnsi="Arial" w:cs="Arial"/>
-          <w:color w:val="808080"/>
-          <w:sz w:val="28"/>
-          <w:szCs w:val="28"/>
-        </w:rPr>
-        <w:t xml:space="preserve">no</w:t>
-      </w:r>
-      <w:r>
-        <w:rPr>
-          <w:rFonts w:ascii="Arial" w:eastAsia="Arial" w:hAnsi="Arial" w:cs="Arial"/>
-          <w:sz w:val="28"/>
-          <w:szCs w:val="28"/>
-        </w:rPr>
-        <w:t xml:space="preserve"> </w:t>
-      </w:r>
-      <w:r>
-        <w:rPr>
-          <w:rFonts w:ascii="Arial" w:eastAsia="Arial" w:hAnsi="Arial" w:cs="Arial"/>
-          <w:color w:val="808080"/>
-          <w:sz w:val="28"/>
-          <w:szCs w:val="28"/>
-        </w:rPr>
-        <w:t xml:space="preserve">apelo, fixou</w:t>
-      </w:r>
-      <w:r>
-        <w:rPr>
-          <w:rFonts w:ascii="Arial" w:eastAsia="Arial" w:hAnsi="Arial" w:cs="Arial"/>
-          <w:sz w:val="28"/>
-          <w:szCs w:val="28"/>
-        </w:rPr>
-        <w:t xml:space="preserve"> a </w:t>
-      </w:r>
-      <w:r>
-        <w:rPr>
-          <w:rFonts w:ascii="Arial" w:eastAsia="Arial" w:hAnsi="Arial" w:cs="Arial"/>
-          <w:color w:val="808080"/>
-          <w:sz w:val="28"/>
-          <w:szCs w:val="28"/>
-        </w:rPr>
-        <w:t xml:space="preserve">seguinte</w:t>
-      </w:r>
-      <w:r>
-        <w:rPr>
-          <w:rFonts w:ascii="Arial" w:eastAsia="Arial" w:hAnsi="Arial" w:cs="Arial"/>
-          <w:sz w:val="28"/>
-          <w:szCs w:val="28"/>
-        </w:rPr>
-        <w:t xml:space="preserve"> </w:t>
-      </w:r>
-      <w:r>
-        <w:rPr>
-          <w:rFonts w:ascii="Arial" w:eastAsia="Arial" w:hAnsi="Arial" w:cs="Arial"/>
-          <w:color w:val="808080"/>
-          <w:sz w:val="28"/>
-          <w:szCs w:val="28"/>
-        </w:rPr>
-        <w:t xml:space="preserve">tese:</w:t>
-      </w:r>
-      <w:commentRangeEnd w:id="17"/>
-      <w:r>
-        <w:rPr>
-          <w:rStyle w:val="CommentReference"/>
-          <w:color w:val="808080"/>
-        </w:rPr>
-        <w:commentReference w:id="17"/>
       </w:r>
     </w:p>
     <w:p>
@@ -5949,7 +6428,7 @@
           <w:color w:val="808080"/>
           <w:sz w:val="28"/>
         </w:rPr>
-        <w:t xml:space="preserve">Por isso, sem impugnação específica da assinatura, a tese não incide e não se transfere ao apelado o ônus de demonstrar a autenticidade da firma.</w:t>
+        <w:t xml:space="preserve">Logo, a tese não incide, e o ônus de demonstrar a autenticidade não se transfere ao apelado.</w:t>
       </w:r>
     </w:p>
     <w:p>
@@ -6040,7 +6519,74 @@
           <w:sz w:val="28"/>
           <w:szCs w:val="28"/>
         </w:rPr>
-        <w:t xml:space="preserve"> está comprovada. A certidão emitida pelo 10º Oficial de Registro de Títulos e Documentos de São Paulo identifica o CPF da apelante, o número do contrato e o valor de R$ 471,44</w:t>
+        <w:t xml:space="preserve"> está comprovada</w:t>
+      </w:r>
+      <w:r>
+        <w:rPr>
+          <w:rFonts w:ascii="Arial" w:eastAsia="Arial" w:hAnsi="Arial" w:cs="Arial"/>
+          <w:sz w:val="28"/>
+          <w:szCs w:val="28"/>
+        </w:rPr>
+        <w:t xml:space="preserve"> </w:t>
+      </w:r>
+      <w:r>
+        <w:rPr>
+          <w:rFonts w:ascii="Arial" w:eastAsia="Arial" w:hAnsi="Arial" w:cs="Arial"/>
+          <w:color w:val="808080"/>
+          <w:sz w:val="28"/>
+          <w:szCs w:val="28"/>
+        </w:rPr>
+        <w:t xml:space="preserve">pela</w:t>
+      </w:r>
+      <w:r>
+        <w:rPr>
+          <w:rFonts w:ascii="Arial" w:eastAsia="Arial" w:hAnsi="Arial" w:cs="Arial"/>
+          <w:sz w:val="28"/>
+          <w:szCs w:val="28"/>
+        </w:rPr>
+        <w:t xml:space="preserve"> certidão </w:t>
+      </w:r>
+      <w:r>
+        <w:rPr>
+          <w:rFonts w:ascii="Arial" w:eastAsia="Arial" w:hAnsi="Arial" w:cs="Arial"/>
+          <w:color w:val="808080"/>
+          <w:sz w:val="28"/>
+          <w:szCs w:val="28"/>
+        </w:rPr>
+        <w:t xml:space="preserve">do</w:t>
+      </w:r>
+      <w:r>
+        <w:rPr>
+          <w:rFonts w:ascii="Arial" w:eastAsia="Arial" w:hAnsi="Arial" w:cs="Arial"/>
+          <w:sz w:val="28"/>
+          <w:szCs w:val="28"/>
+        </w:rPr>
+        <w:t xml:space="preserve"> 10º Oficial de Registro de Títulos e Documentos de São Paulo</w:t>
+      </w:r>
+      <w:r>
+        <w:rPr>
+          <w:rFonts w:ascii="Arial" w:eastAsia="Arial" w:hAnsi="Arial" w:cs="Arial"/>
+          <w:color w:val="808080"/>
+          <w:sz w:val="28"/>
+          <w:szCs w:val="28"/>
+        </w:rPr>
+        <w:t xml:space="preserve">, que</w:t>
+      </w:r>
+      <w:r>
+        <w:rPr>
+          <w:rFonts w:ascii="Arial" w:eastAsia="Arial" w:hAnsi="Arial" w:cs="Arial"/>
+          <w:sz w:val="28"/>
+          <w:szCs w:val="28"/>
+        </w:rPr>
+        <w:t xml:space="preserve"> identifica o CPF da apelante, o</w:t>
+      </w:r>
+      <w:r>
+        <w:rPr>
+          <w:rFonts w:ascii="Arial" w:eastAsia="Arial" w:hAnsi="Arial" w:cs="Arial"/>
+          <w:sz w:val="28"/>
+          <w:szCs w:val="28"/>
+        </w:rPr>
+        <w:t xml:space="preserve"> contrato e o valor de R$ 471,44</w:t>
       </w:r>
       <w:r>
         <w:rPr>
@@ -6074,14 +6620,14 @@
         <w:jc w:val="both"/>
         <w:rPr/>
       </w:pPr>
-      <w:commentRangeStart w:id="18"/>
-      <w:r>
-        <w:rPr>
-          <w:rFonts w:ascii="Arial" w:eastAsia="Arial" w:hAnsi="Arial" w:cs="Arial"/>
-          <w:sz w:val="28"/>
-          <w:szCs w:val="28"/>
-        </w:rPr>
-        <w:t xml:space="preserve">Com isso, a obrigação originária fica vinculada ao crédito transferido ao fundo cessionário</w:t>
+      <w:commentRangeStart w:id="17"/>
+      <w:r>
+        <w:rPr>
+          <w:rFonts w:ascii="Arial" w:eastAsia="Arial" w:hAnsi="Arial" w:cs="Arial"/>
+          <w:sz w:val="28"/>
+          <w:szCs w:val="28"/>
+        </w:rPr>
+        <w:t xml:space="preserve">A cessão não depende da anuência do devedor</w:t>
       </w:r>
       <w:r>
         <w:rPr>
@@ -6098,6 +6644,40 @@
           <w:sz w:val="28"/>
           <w:szCs w:val="28"/>
         </w:rPr>
+        <w:t xml:space="preserve"> e </w:t>
+      </w:r>
+      <w:r>
+        <w:rPr>
+          <w:rFonts w:ascii="Arial" w:eastAsia="Arial" w:hAnsi="Arial" w:cs="Arial"/>
+          <w:color w:val="808080"/>
+          <w:sz w:val="28"/>
+          <w:szCs w:val="28"/>
+        </w:rPr>
+        <w:t xml:space="preserve">a</w:t>
+      </w:r>
+      <w:r>
+        <w:rPr>
+          <w:rFonts w:ascii="Arial" w:eastAsia="Arial" w:hAnsi="Arial" w:cs="Arial"/>
+          <w:sz w:val="28"/>
+          <w:szCs w:val="28"/>
+        </w:rPr>
+        <w:t xml:space="preserve"> ausência de notificação não torna a dívida inexigível nem impede o cessionário de praticar atos </w:t>
+      </w:r>
+      <w:r>
+        <w:rPr>
+          <w:rFonts w:ascii="Arial" w:eastAsia="Arial" w:hAnsi="Arial" w:cs="Arial"/>
+          <w:color w:val="808080"/>
+          <w:sz w:val="28"/>
+          <w:szCs w:val="28"/>
+        </w:rPr>
+        <w:t xml:space="preserve">conservatórios</w:t>
+      </w:r>
+      <w:r>
+        <w:rPr>
+          <w:rFonts w:ascii="Arial" w:eastAsia="Arial" w:hAnsi="Arial" w:cs="Arial"/>
+          <w:sz w:val="28"/>
+          <w:szCs w:val="28"/>
+        </w:rPr>
         <w:t xml:space="preserve"> </w:t>
       </w:r>
       <w:r>
@@ -6107,7 +6687,7 @@
           <w:sz w:val="28"/>
           <w:szCs w:val="28"/>
         </w:rPr>
-        <w:t xml:space="preserve">nos</w:t>
+        <w:t xml:space="preserve">(CC</w:t>
       </w:r>
       <w:r>
         <w:rPr>
@@ -6124,7 +6704,7 @@
           <w:sz w:val="28"/>
           <w:szCs w:val="28"/>
         </w:rPr>
-        <w:t xml:space="preserve">termos</w:t>
+        <w:t xml:space="preserve">286</w:t>
       </w:r>
       <w:r>
         <w:rPr>
@@ -6141,7 +6721,7 @@
           <w:sz w:val="28"/>
           <w:szCs w:val="28"/>
         </w:rPr>
-        <w:t xml:space="preserve">dos</w:t>
+        <w:t xml:space="preserve">e</w:t>
       </w:r>
       <w:r>
         <w:rPr>
@@ -6154,27 +6734,19 @@
       <w:r>
         <w:rPr>
           <w:rFonts w:ascii="Arial" w:eastAsia="Arial" w:hAnsi="Arial" w:cs="Arial"/>
-          <w:sz w:val="28"/>
-          <w:szCs w:val="28"/>
-        </w:rPr>
-        <w:t xml:space="preserve">arts. 286 e 293 do </w:t>
-      </w:r>
-      <w:r>
-        <w:rPr>
-          <w:rFonts w:ascii="Arial" w:eastAsia="Arial" w:hAnsi="Arial" w:cs="Arial"/>
-          <w:color w:val="808080"/>
-          <w:sz w:val="28"/>
-          <w:szCs w:val="28"/>
-        </w:rPr>
-        <w:t xml:space="preserve">CC:</w:t>
-      </w:r>
-      <w:commentRangeEnd w:id="18"/>
+          <w:color w:val="808080"/>
+          <w:sz w:val="28"/>
+          <w:szCs w:val="28"/>
+        </w:rPr>
+        <w:t xml:space="preserve">293):</w:t>
+      </w:r>
+      <w:commentRangeEnd w:id="17"/>
       <w:r>
         <w:rPr>
           <w:rStyle w:val="CommentReference"/>
           <w:color w:val="808080"/>
         </w:rPr>
-        <w:commentReference w:id="18"/>
+        <w:commentReference w:id="17"/>
       </w:r>
     </w:p>
     <w:p>
@@ -6201,90 +6773,30 @@
           <w:sz w:val="26"/>
           <w:szCs w:val="28"/>
         </w:rPr>
-        <w:t xml:space="preserve">“Art. 286. O credor pode ceder o seu crédito, se a isso não se opuser a natureza da obrigação, a lei, ou a convenção com o devedor; a cláusula proibitiva da cessão não poderá ser oposta ao cessionário de boa-fé, se não constar do instrumento da obrigação.</w:t>
-      </w:r>
-    </w:p>
-    <w:p>
-      <w:pPr>
-        <w:spacing w:after="0" w:line="360" w:lineRule="auto"/>
-        <w:ind w:left="2268" w:firstLine="0"/>
-        <w:jc w:val="both"/>
-        <w:rPr/>
-      </w:pPr>
-      <w:r>
-        <w:rPr>
-          <w:rFonts w:ascii="Arial" w:hAnsi="Arial"/>
+        <w:t xml:space="preserve">“Art. 293. Independentemente do conhecimento da cessão pelo devedor, </w:t>
+      </w:r>
+      <w:r>
+        <w:rPr>
+          <w:rFonts w:ascii="Arial" w:eastAsia="Arial" w:hAnsi="Arial" w:cs="Arial"/>
           <w:b w:val="0"/>
           <w:i/>
           <w:color w:val="808080"/>
           <w:sz w:val="26"/>
-        </w:rPr>
-        <w:t xml:space="preserve">(...)</w:t>
-      </w:r>
-    </w:p>
-    <w:p>
-      <w:pPr>
-        <w:spacing w:after="0" w:line="360" w:lineRule="auto"/>
-        <w:ind w:left="2268" w:firstLine="0"/>
-        <w:jc w:val="both"/>
-        <w:rPr/>
-      </w:pPr>
-      <w:r>
-        <w:rPr>
-          <w:rFonts w:ascii="Arial" w:hAnsi="Arial"/>
+          <w:szCs w:val="28"/>
+          <w:u w:val="single"/>
+        </w:rPr>
+        <w:t xml:space="preserve">pode o cessionário exercer os atos conservatórios do direito cedido</w:t>
+      </w:r>
+      <w:r>
+        <w:rPr>
+          <w:rFonts w:ascii="Arial" w:eastAsia="Arial" w:hAnsi="Arial" w:cs="Arial"/>
           <w:b w:val="0"/>
           <w:i/>
           <w:color w:val="808080"/>
           <w:sz w:val="26"/>
-        </w:rPr>
-        <w:t xml:space="preserve">Art. 293. Independentemente do conhecimento da cessão pelo devedor, </w:t>
-      </w:r>
-      <w:r>
-        <w:rPr>
-          <w:rFonts w:ascii="Arial" w:hAnsi="Arial"/>
-          <w:b w:val="0"/>
-          <w:i/>
-          <w:color w:val="808080"/>
-          <w:sz w:val="26"/>
-          <w:u w:val="single"/>
-        </w:rPr>
-        <w:t xml:space="preserve">pode o cessionário exercer os atos conservatórios do direito cedido</w:t>
-      </w:r>
-      <w:r>
-        <w:rPr>
-          <w:rFonts w:ascii="Arial" w:hAnsi="Arial"/>
-          <w:b w:val="0"/>
-          <w:i/>
-          <w:color w:val="808080"/>
-          <w:sz w:val="26"/>
+          <w:szCs w:val="28"/>
         </w:rPr>
         <w:t xml:space="preserve">.” – Grifei</w:t>
-      </w:r>
-    </w:p>
-    <w:p>
-      <w:pPr>
-        <w:spacing w:after="0" w:line="360" w:lineRule="auto"/>
-        <w:ind w:left="2268" w:firstLine="0"/>
-        <w:jc w:val="both"/>
-        <w:rPr/>
-      </w:pPr>
-    </w:p>
-    <w:p>
-      <w:pPr>
-        <w:spacing w:after="0" w:line="360" w:lineRule="auto"/>
-        <w:ind w:firstLine="2268"/>
-        <w:jc w:val="both"/>
-        <w:rPr/>
-      </w:pPr>
-      <w:r>
-        <w:rPr>
-          <w:rFonts w:ascii="Arial" w:hAnsi="Arial"/>
-          <w:b w:val="0"/>
-          <w:i w:val="0"/>
-          <w:color w:val="808080"/>
-          <w:sz w:val="28"/>
-        </w:rPr>
-        <w:t xml:space="preserve">Assim, a cessão não depende da anuência do devedor, e eventual ausência de notificação não torna a dívida inexigível nem impede o cessionário de praticar atos de conservação do crédito.</w:t>
       </w:r>
     </w:p>
     <w:p>
@@ -6402,7 +6914,7 @@
           <w:szCs w:val="26"/>
         </w:rPr>
       </w:pPr>
-      <w:commentRangeStart w:id="19"/>
+      <w:commentRangeStart w:id="18"/>
       <w:r>
         <w:rPr>
           <w:rFonts w:ascii="Arial" w:eastAsia="Arial" w:hAnsi="Arial" w:cs="Arial"/>
@@ -6412,7 +6924,7 @@
           <w:sz w:val="26"/>
           <w:szCs w:val="26"/>
         </w:rPr>
-        <w:t xml:space="preserve">“</w:t>
+        <w:t xml:space="preserve">“(...) </w:t>
       </w:r>
       <w:r>
         <w:rPr>
@@ -6422,27 +6934,7 @@
           <w:sz w:val="26"/>
           <w:szCs w:val="26"/>
         </w:rPr>
-        <w:t xml:space="preserve">(...)</w:t>
-      </w:r>
-      <w:r>
-        <w:rPr>
-          <w:rFonts w:ascii="Arial" w:eastAsia="Arial" w:hAnsi="Arial" w:cs="Arial"/>
-          <w:i/>
-          <w:iCs/>
-          <w:sz w:val="26"/>
-          <w:szCs w:val="26"/>
-        </w:rPr>
-        <w:t xml:space="preserve"> </w:t>
-      </w:r>
-      <w:r>
-        <w:rPr>
-          <w:rFonts w:ascii="Arial" w:eastAsia="Arial" w:hAnsi="Arial" w:cs="Arial"/>
-          <w:i/>
-          <w:iCs/>
-          <w:sz w:val="26"/>
-          <w:szCs w:val="26"/>
-        </w:rPr>
-        <w:t xml:space="preserve">8. </w:t>
+        <w:t xml:space="preserve">9. </w:t>
       </w:r>
       <w:r>
         <w:rPr>
@@ -6453,7 +6945,7 @@
           <w:szCs w:val="26"/>
           <w:u w:val="single"/>
         </w:rPr>
-        <w:t xml:space="preserve">A mera negativa genérica da contratação ou da existência da dívida não prevalece diante da prova documental produzida nos autos</w:t>
+        <w:t xml:space="preserve">A cessão de crédito constitui negócio jurídico válido e eficaz entre cedente e cessionário, independentemente da anuência do devedor</w:t>
       </w:r>
       <w:r>
         <w:rPr>
@@ -6463,14 +6955,14 @@
           <w:sz w:val="26"/>
           <w:szCs w:val="26"/>
         </w:rPr>
-        <w:t xml:space="preserve">, especialmente quando proveniente da instituição financeira originária da operação e submetida ao contraditório. </w:t>
-      </w:r>
-      <w:commentRangeEnd w:id="19"/>
+        <w:t xml:space="preserve">, nos termos do art. 286 do Código Civil. </w:t>
+      </w:r>
+      <w:commentRangeEnd w:id="18"/>
       <w:r>
         <w:rPr>
           <w:rStyle w:val="CommentReference"/>
         </w:rPr>
-        <w:commentReference w:id="19"/>
+        <w:commentReference w:id="18"/>
       </w:r>
     </w:p>
     <w:p>
@@ -6494,7 +6986,7 @@
           <w:sz w:val="26"/>
           <w:szCs w:val="26"/>
         </w:rPr>
-        <w:t xml:space="preserve">9. </w:t>
+        <w:t xml:space="preserve">10. </w:t>
       </w:r>
       <w:r>
         <w:rPr>
@@ -6505,7 +6997,7 @@
           <w:szCs w:val="26"/>
           <w:u w:val="single"/>
         </w:rPr>
-        <w:t xml:space="preserve">A cessão de crédito constitui negócio jurídico válido e eficaz entre cedente e cessionário, independentemente da anuência do devedor</w:t>
+        <w:t xml:space="preserve">A ausência de notificação prevista no art. 290 do Código Civil não invalida a cessão de crédito nem compromete a legitimidade ativa do cessionário para promover a cobrança da obrigação</w:t>
       </w:r>
       <w:r>
         <w:rPr>
@@ -6515,14 +7007,20 @@
           <w:sz w:val="26"/>
           <w:szCs w:val="26"/>
         </w:rPr>
-        <w:t xml:space="preserve">, nos termos do art. 286 do Código Civil. </w:t>
-      </w:r>
-    </w:p>
-    <w:p>
-      <w:pPr>
-        <w:spacing w:after="0" w:line="360" w:lineRule="auto"/>
-        <w:ind w:left="2268"/>
-        <w:jc w:val="both"/>
+        <w:t xml:space="preserve">. </w:t>
+      </w:r>
+      <w:r>
+        <w:rPr>
+          <w:rFonts w:ascii="Arial" w:eastAsia="Arial" w:hAnsi="Arial" w:cs="Arial"/>
+          <w:i/>
+          <w:iCs/>
+          <w:color w:val="808080"/>
+          <w:sz w:val="26"/>
+          <w:szCs w:val="26"/>
+        </w:rPr>
+        <w:t xml:space="preserve">(</w:t>
+      </w:r>
+      <w:r>
         <w:rPr>
           <w:rFonts w:ascii="Arial" w:eastAsia="Arial" w:hAnsi="Arial" w:cs="Arial"/>
           <w:i/>
@@ -6530,8 +7028,25 @@
           <w:sz w:val="26"/>
           <w:szCs w:val="26"/>
         </w:rPr>
-      </w:pPr>
-      <w:r>
+        <w:t xml:space="preserve">.</w:t>
+      </w:r>
+      <w:r>
+        <w:rPr>
+          <w:rFonts w:ascii="Arial" w:eastAsia="Arial" w:hAnsi="Arial" w:cs="Arial"/>
+          <w:i/>
+          <w:iCs/>
+          <w:color w:val="808080"/>
+          <w:sz w:val="26"/>
+          <w:szCs w:val="26"/>
+        </w:rPr>
+        <w:t xml:space="preserve">..)</w:t>
+      </w:r>
+    </w:p>
+    <w:p>
+      <w:pPr>
+        <w:spacing w:after="0" w:line="360" w:lineRule="auto"/>
+        <w:ind w:left="2268"/>
+        <w:jc w:val="both"/>
         <w:rPr>
           <w:rFonts w:ascii="Arial" w:eastAsia="Arial" w:hAnsi="Arial" w:cs="Arial"/>
           <w:i/>
@@ -6539,7 +7054,16 @@
           <w:sz w:val="26"/>
           <w:szCs w:val="26"/>
         </w:rPr>
-        <w:t xml:space="preserve">10. </w:t>
+      </w:pPr>
+      <w:r>
+        <w:rPr>
+          <w:rFonts w:ascii="Arial" w:eastAsia="Arial" w:hAnsi="Arial" w:cs="Arial"/>
+          <w:i/>
+          <w:iCs/>
+          <w:sz w:val="26"/>
+          <w:szCs w:val="26"/>
+        </w:rPr>
+        <w:t xml:space="preserve">12. A inscrição restritiva fundada em débito existente, exigível e regularmente cedido </w:t>
       </w:r>
       <w:r>
         <w:rPr>
@@ -6550,7 +7074,7 @@
           <w:szCs w:val="26"/>
           <w:u w:val="single"/>
         </w:rPr>
-        <w:t xml:space="preserve">A ausência de notificação prevista no art. 290 do Código Civil não invalida a cessão de crédito nem compromete a legitimidade ativa do cessionário para promover a cobrança da obrigação</w:t>
+        <w:t xml:space="preserve">configura exercício regular de direito do credor, afastando a caracterização de ato ilícito</w:t>
       </w:r>
       <w:r>
         <w:rPr>
@@ -6560,9 +7084,25 @@
           <w:sz w:val="26"/>
           <w:szCs w:val="26"/>
         </w:rPr>
-        <w:t xml:space="preserve">. A comunicação ao </w:t>
-      </w:r>
-      <w:r>
+        <w:t xml:space="preserve">. </w:t>
+      </w:r>
+      <w:r>
+        <w:rPr>
+          <w:rFonts w:ascii="Arial" w:eastAsia="Arial" w:hAnsi="Arial" w:cs="Arial"/>
+          <w:i/>
+          <w:iCs/>
+          <w:color w:val="808080"/>
+          <w:sz w:val="26"/>
+          <w:szCs w:val="26"/>
+        </w:rPr>
+        <w:t xml:space="preserve">(...)”</w:t>
+      </w:r>
+    </w:p>
+    <w:p>
+      <w:pPr>
+        <w:spacing w:after="0" w:line="360" w:lineRule="auto"/>
+        <w:ind w:left="2268"/>
+        <w:jc w:val="both"/>
         <w:rPr>
           <w:rFonts w:ascii="Arial" w:eastAsia="Arial" w:hAnsi="Arial" w:cs="Arial"/>
           <w:i/>
@@ -6570,15 +7110,8 @@
           <w:sz w:val="26"/>
           <w:szCs w:val="26"/>
         </w:rPr>
-        <w:lastRenderedPageBreak/>
-        <w:t xml:space="preserve">devedor destina-se exclusivamente a resguardar sua boa-fé quanto à pessoa legitimada para receber o pagamento, não constituindo requisito de validade ou eficácia do negócio jurídico entre as partes contratantes. </w:t>
-      </w:r>
-    </w:p>
-    <w:p>
-      <w:pPr>
-        <w:spacing w:after="0" w:line="360" w:lineRule="auto"/>
-        <w:ind w:left="2268"/>
-        <w:jc w:val="both"/>
+      </w:pPr>
+      <w:r>
         <w:rPr>
           <w:rFonts w:ascii="Arial" w:eastAsia="Arial" w:hAnsi="Arial" w:cs="Arial"/>
           <w:i/>
@@ -6586,7 +7119,19 @@
           <w:sz w:val="26"/>
           <w:szCs w:val="26"/>
         </w:rPr>
-      </w:pPr>
+        <w:t xml:space="preserve">(Acórdão 2168573, 0712221-74.2025.8.07.0018, Relator(a): FÁTIMA RAFAEL, 7ª TURMA CÍVEL, data de julgamento: 26/08/2026, publicado no DJe: 17/09/2026</w:t>
+      </w:r>
+      <w:r>
+        <w:rPr>
+          <w:rFonts w:ascii="Arial" w:eastAsia="Arial" w:hAnsi="Arial" w:cs="Arial"/>
+          <w:i/>
+          <w:iCs/>
+          <w:color w:val="808080"/>
+          <w:sz w:val="26"/>
+          <w:szCs w:val="26"/>
+        </w:rPr>
+        <w:t xml:space="preserve">.</w:t>
+      </w:r>
       <w:r>
         <w:rPr>
           <w:rFonts w:ascii="Arial" w:eastAsia="Arial" w:hAnsi="Arial" w:cs="Arial"/>
@@ -6595,162 +7140,16 @@
           <w:sz w:val="26"/>
           <w:szCs w:val="26"/>
         </w:rPr>
-        <w:t xml:space="preserve">11. Demonstradas a contratação, a constituição da dívida e a regular transferência do crédito, </w:t>
+        <w:t xml:space="preserve">)</w:t>
       </w:r>
       <w:r>
         <w:rPr>
           <w:rFonts w:ascii="Arial" w:eastAsia="Arial" w:hAnsi="Arial" w:cs="Arial"/>
           <w:i/>
           <w:iCs/>
+          <w:color w:val="808080"/>
           <w:sz w:val="26"/>
           <w:szCs w:val="26"/>
-          <w:u w:val="single"/>
-        </w:rPr>
-        <w:t xml:space="preserve">revela-se legítima a atuação da cessionária na cobrança da obrigação e na inscrição do nome do devedor nos cadastros de inadimplentes</w:t>
-      </w:r>
-      <w:r>
-        <w:rPr>
-          <w:rFonts w:ascii="Arial" w:eastAsia="Arial" w:hAnsi="Arial" w:cs="Arial"/>
-          <w:i/>
-          <w:iCs/>
-          <w:sz w:val="26"/>
-          <w:szCs w:val="26"/>
-        </w:rPr>
-        <w:t xml:space="preserve">. </w:t>
-      </w:r>
-    </w:p>
-    <w:p>
-      <w:pPr>
-        <w:spacing w:after="0" w:line="360" w:lineRule="auto"/>
-        <w:ind w:left="2268"/>
-        <w:jc w:val="both"/>
-        <w:rPr>
-          <w:rFonts w:ascii="Arial" w:eastAsia="Arial" w:hAnsi="Arial" w:cs="Arial"/>
-          <w:i/>
-          <w:iCs/>
-          <w:sz w:val="26"/>
-          <w:szCs w:val="26"/>
-        </w:rPr>
-      </w:pPr>
-      <w:r>
-        <w:rPr>
-          <w:rFonts w:ascii="Arial" w:eastAsia="Arial" w:hAnsi="Arial" w:cs="Arial"/>
-          <w:i/>
-          <w:iCs/>
-          <w:sz w:val="26"/>
-          <w:szCs w:val="26"/>
-        </w:rPr>
-        <w:t xml:space="preserve">12. A inscrição restritiva fundada em débito existente, exigível e regularmente cedido </w:t>
-      </w:r>
-      <w:r>
-        <w:rPr>
-          <w:rFonts w:ascii="Arial" w:eastAsia="Arial" w:hAnsi="Arial" w:cs="Arial"/>
-          <w:i/>
-          <w:iCs/>
-          <w:sz w:val="26"/>
-          <w:szCs w:val="26"/>
-          <w:u w:val="single"/>
-        </w:rPr>
-        <w:t xml:space="preserve">configura exercício regular de direito do credor, afastando a caracterização de ato ilícito</w:t>
-      </w:r>
-      <w:r>
-        <w:rPr>
-          <w:rFonts w:ascii="Arial" w:eastAsia="Arial" w:hAnsi="Arial" w:cs="Arial"/>
-          <w:i/>
-          <w:iCs/>
-          <w:sz w:val="26"/>
-          <w:szCs w:val="26"/>
-        </w:rPr>
-        <w:t xml:space="preserve">. </w:t>
-      </w:r>
-    </w:p>
-    <w:p>
-      <w:pPr>
-        <w:spacing w:after="0" w:line="360" w:lineRule="auto"/>
-        <w:ind w:left="2268"/>
-        <w:jc w:val="both"/>
-        <w:rPr>
-          <w:rFonts w:ascii="Arial" w:eastAsia="Arial" w:hAnsi="Arial" w:cs="Arial"/>
-          <w:i/>
-          <w:iCs/>
-          <w:sz w:val="26"/>
-          <w:szCs w:val="26"/>
-        </w:rPr>
-      </w:pPr>
-      <w:r>
-        <w:rPr>
-          <w:rFonts w:ascii="Arial" w:eastAsia="Arial" w:hAnsi="Arial" w:cs="Arial"/>
-          <w:i/>
-          <w:iCs/>
-          <w:sz w:val="26"/>
-          <w:szCs w:val="26"/>
-        </w:rPr>
-        <w:t xml:space="preserve">13. Reconhecida a regularidade da negativação, inexiste conduta ilícita apta a justificar a reparação civil. Ausente pressuposto indispensável da responsabilidade civil, não se configura o dever de indenizar por danos morais. </w:t>
-      </w:r>
-      <w:r>
-        <w:rPr>
-          <w:rFonts w:ascii="Arial" w:eastAsia="Arial" w:hAnsi="Arial" w:cs="Arial"/>
-          <w:i/>
-          <w:iCs/>
-          <w:color w:val="808080"/>
-          <w:sz w:val="26"/>
-          <w:szCs w:val="26"/>
-        </w:rPr>
-        <w:t xml:space="preserve">(...)”</w:t>
-      </w:r>
-    </w:p>
-    <w:p>
-      <w:pPr>
-        <w:spacing w:after="0" w:line="360" w:lineRule="auto"/>
-        <w:ind w:left="2268"/>
-        <w:jc w:val="both"/>
-        <w:rPr>
-          <w:rFonts w:ascii="Arial" w:eastAsia="Arial" w:hAnsi="Arial" w:cs="Arial"/>
-          <w:i/>
-          <w:iCs/>
-          <w:sz w:val="26"/>
-          <w:szCs w:val="26"/>
-        </w:rPr>
-      </w:pPr>
-      <w:r>
-        <w:rPr>
-          <w:rFonts w:ascii="Arial" w:eastAsia="Arial" w:hAnsi="Arial" w:cs="Arial"/>
-          <w:i/>
-          <w:iCs/>
-          <w:sz w:val="26"/>
-          <w:szCs w:val="26"/>
-        </w:rPr>
-        <w:t xml:space="preserve">(Acórdão 2168573, 0712221-74.2025.8.07.0018, Relator(a): FÁTIMA RAFAEL, 7ª TURMA CÍVEL, data de julgamento: 26/08/2026, publicado no DJe: 17/09/2026</w:t>
-      </w:r>
-      <w:r>
-        <w:rPr>
-          <w:rFonts w:ascii="Arial" w:eastAsia="Arial" w:hAnsi="Arial" w:cs="Arial"/>
-          <w:i/>
-          <w:iCs/>
-          <w:color w:val="808080"/>
-          <w:sz w:val="26"/>
-          <w:szCs w:val="26"/>
-        </w:rPr>
-        <w:t xml:space="preserve">.</w:t>
-      </w:r>
-      <w:r>
-        <w:rPr>
-          <w:rFonts w:ascii="Arial" w:eastAsia="Arial" w:hAnsi="Arial" w:cs="Arial"/>
-          <w:i/>
-          <w:iCs/>
-          <w:sz w:val="26"/>
-          <w:szCs w:val="26"/>
-        </w:rPr>
-        <w:t xml:space="preserve">)</w:t>
-      </w:r>
-      <w:r>
-        <w:rPr>
-          <w:rFonts w:ascii="Arial" w:eastAsia="Arial" w:hAnsi="Arial" w:cs="Arial"/>
-          <w:i/>
-          <w:iCs/>
-          <w:color w:val="808080"/>
-          <w:sz w:val="26"/>
-          <w:szCs w:val="26"/>
         </w:rPr>
         <w:t xml:space="preserve"> – Grifei</w:t>
       </w:r>
@@ -6863,7 +7262,7 @@
           <w:szCs w:val="28"/>
         </w:rPr>
       </w:pPr>
-      <w:commentRangeStart w:id="20"/>
+      <w:commentRangeStart w:id="19"/>
       <w:r>
         <w:rPr>
           <w:rFonts w:ascii="Arial" w:eastAsia="Arial" w:hAnsi="Arial" w:cs="Arial"/>
@@ -6892,12 +7291,12 @@
         </w:rPr>
         <w:t xml:space="preserve"> DE FALHA NA PRESTAÇÃO DO SERVIÇO</w:t>
       </w:r>
-      <w:commentRangeEnd w:id="20"/>
+      <w:commentRangeEnd w:id="19"/>
       <w:r>
         <w:rPr>
           <w:rStyle w:val="CommentReference"/>
         </w:rPr>
-        <w:commentReference w:id="20"/>
+        <w:commentReference w:id="19"/>
       </w:r>
     </w:p>
     <w:p>
@@ -6918,7 +7317,7 @@
         <w:ind w:firstLine="2268"/>
         <w:jc w:val="both"/>
       </w:pPr>
-      <w:commentRangeStart w:id="21"/>
+      <w:commentRangeStart w:id="20"/>
       <w:r>
         <w:rPr>
           <w:rFonts w:ascii="Arial" w:eastAsia="Arial" w:hAnsi="Arial" w:cs="Arial"/>
@@ -6977,15 +7376,83 @@
           <w:sz w:val="28"/>
           <w:szCs w:val="28"/>
         </w:rPr>
-        <w:t xml:space="preserve"> a imputação de obrigação sem lastro contratual comprovado caracteriza falha na prestação do serviço, a ensejar a responsabilidade objetiva prevista no art. 14</w:t>
-      </w:r>
-      <w:r>
-        <w:rPr>
-          <w:rFonts w:ascii="Arial" w:eastAsia="Arial" w:hAnsi="Arial" w:cs="Arial"/>
-          <w:sz w:val="28"/>
-          <w:szCs w:val="28"/>
-        </w:rPr>
-        <w:t xml:space="preserve"> do CDC; </w:t>
+        <w:t xml:space="preserve"> a </w:t>
+      </w:r>
+      <w:r>
+        <w:rPr>
+          <w:rFonts w:ascii="Arial" w:eastAsia="Arial" w:hAnsi="Arial" w:cs="Arial"/>
+          <w:color w:val="808080"/>
+          <w:sz w:val="28"/>
+          <w:szCs w:val="28"/>
+        </w:rPr>
+        <w:t xml:space="preserve">cobrança</w:t>
+      </w:r>
+      <w:r>
+        <w:rPr>
+          <w:rFonts w:ascii="Arial" w:eastAsia="Arial" w:hAnsi="Arial" w:cs="Arial"/>
+          <w:sz w:val="28"/>
+          <w:szCs w:val="28"/>
+        </w:rPr>
+        <w:t xml:space="preserve"> sem lastro contratual </w:t>
+      </w:r>
+      <w:r>
+        <w:rPr>
+          <w:rFonts w:ascii="Arial" w:eastAsia="Arial" w:hAnsi="Arial" w:cs="Arial"/>
+          <w:color w:val="808080"/>
+          <w:sz w:val="28"/>
+          <w:szCs w:val="28"/>
+        </w:rPr>
+        <w:t xml:space="preserve">configura</w:t>
+      </w:r>
+      <w:r>
+        <w:rPr>
+          <w:rFonts w:ascii="Arial" w:eastAsia="Arial" w:hAnsi="Arial" w:cs="Arial"/>
+          <w:sz w:val="28"/>
+          <w:szCs w:val="28"/>
+        </w:rPr>
+        <w:t xml:space="preserve"> falha na prestação do serviço</w:t>
+      </w:r>
+      <w:r>
+        <w:rPr>
+          <w:rFonts w:ascii="Arial" w:eastAsia="Arial" w:hAnsi="Arial" w:cs="Arial"/>
+          <w:sz w:val="28"/>
+          <w:szCs w:val="28"/>
+        </w:rPr>
+        <w:t xml:space="preserve"> </w:t>
+      </w:r>
+      <w:r>
+        <w:rPr>
+          <w:rFonts w:ascii="Arial" w:eastAsia="Arial" w:hAnsi="Arial" w:cs="Arial"/>
+          <w:color w:val="808080"/>
+          <w:sz w:val="28"/>
+          <w:szCs w:val="28"/>
+        </w:rPr>
+        <w:t xml:space="preserve">(CDC</w:t>
+      </w:r>
+      <w:r>
+        <w:rPr>
+          <w:rFonts w:ascii="Arial" w:eastAsia="Arial" w:hAnsi="Arial" w:cs="Arial"/>
+          <w:sz w:val="28"/>
+          <w:szCs w:val="28"/>
+        </w:rPr>
+        <w:t xml:space="preserve"> 14</w:t>
+      </w:r>
+      <w:r>
+        <w:rPr>
+          <w:rFonts w:ascii="Arial" w:eastAsia="Arial" w:hAnsi="Arial" w:cs="Arial"/>
+          <w:color w:val="808080"/>
+          <w:sz w:val="28"/>
+          <w:szCs w:val="28"/>
+        </w:rPr>
+        <w:t xml:space="preserve">)</w:t>
+      </w:r>
+      <w:r>
+        <w:rPr>
+          <w:rFonts w:ascii="Arial" w:eastAsia="Arial" w:hAnsi="Arial" w:cs="Arial"/>
+          <w:sz w:val="28"/>
+          <w:szCs w:val="28"/>
+        </w:rPr>
+        <w:t xml:space="preserve">; </w:t>
       </w:r>
       <w:r>
         <w:rPr>
@@ -7003,7 +7470,49 @@
           <w:sz w:val="28"/>
           <w:szCs w:val="28"/>
         </w:rPr>
-        <w:t xml:space="preserve"> a inserção do débito em plataforma de negociação, apta a influenciar a pontuação de crédito, viola o dever de veracidade das informações cadastrais previsto no art. 43 do CDC; e </w:t>
+        <w:t xml:space="preserve"> a inserção do débito em plataforma de negociação</w:t>
+      </w:r>
+      <w:r>
+        <w:rPr>
+          <w:rFonts w:ascii="Arial" w:eastAsia="Arial" w:hAnsi="Arial" w:cs="Arial"/>
+          <w:sz w:val="28"/>
+          <w:szCs w:val="28"/>
+        </w:rPr>
+        <w:t xml:space="preserve"> viola o dever de veracidade das informações </w:t>
+      </w:r>
+      <w:r>
+        <w:rPr>
+          <w:rFonts w:ascii="Arial" w:eastAsia="Arial" w:hAnsi="Arial" w:cs="Arial"/>
+          <w:color w:val="808080"/>
+          <w:sz w:val="28"/>
+          <w:szCs w:val="28"/>
+        </w:rPr>
+        <w:t xml:space="preserve">(CDC</w:t>
+      </w:r>
+      <w:r>
+        <w:rPr>
+          <w:rFonts w:ascii="Arial" w:eastAsia="Arial" w:hAnsi="Arial" w:cs="Arial"/>
+          <w:sz w:val="28"/>
+          <w:szCs w:val="28"/>
+        </w:rPr>
+        <w:t xml:space="preserve"> 43</w:t>
+      </w:r>
+      <w:r>
+        <w:rPr>
+          <w:rFonts w:ascii="Arial" w:eastAsia="Arial" w:hAnsi="Arial" w:cs="Arial"/>
+          <w:color w:val="808080"/>
+          <w:sz w:val="28"/>
+          <w:szCs w:val="28"/>
+        </w:rPr>
+        <w:t xml:space="preserve">)</w:t>
+      </w:r>
+      <w:r>
+        <w:rPr>
+          <w:rFonts w:ascii="Arial" w:eastAsia="Arial" w:hAnsi="Arial" w:cs="Arial"/>
+          <w:sz w:val="28"/>
+          <w:szCs w:val="28"/>
+        </w:rPr>
+        <w:t xml:space="preserve">; e </w:t>
       </w:r>
       <w:r>
         <w:rPr>
@@ -7021,7 +7530,24 @@
           <w:sz w:val="28"/>
           <w:szCs w:val="28"/>
         </w:rPr>
-        <w:t xml:space="preserve"> o excesso de cobranças, a repercussão no </w:t>
+        <w:t xml:space="preserve"> o excesso de cobranças</w:t>
+      </w:r>
+      <w:r>
+        <w:rPr>
+          <w:rFonts w:ascii="Arial" w:eastAsia="Arial" w:hAnsi="Arial" w:cs="Arial"/>
+          <w:color w:val="808080"/>
+          <w:sz w:val="28"/>
+          <w:szCs w:val="28"/>
+        </w:rPr>
+        <w:t xml:space="preserve"> e</w:t>
+      </w:r>
+      <w:r>
+        <w:rPr>
+          <w:rFonts w:ascii="Arial" w:eastAsia="Arial" w:hAnsi="Arial" w:cs="Arial"/>
+          <w:sz w:val="28"/>
+          <w:szCs w:val="28"/>
+        </w:rPr>
+        <w:t xml:space="preserve"> a repercussão no </w:t>
       </w:r>
       <w:r>
         <w:rPr>
@@ -7039,14 +7565,22 @@
           <w:sz w:val="28"/>
           <w:szCs w:val="28"/>
         </w:rPr>
-        <w:t xml:space="preserve">, o impacto no acesso ao crédito e a necessidade de recorrer ao Poder Judiciário configuram dano moral indenizável.</w:t>
-      </w:r>
-      <w:commentRangeEnd w:id="21"/>
+        <w:t xml:space="preserve"> configuram dano moral</w:t>
+      </w:r>
+      <w:r>
+        <w:rPr>
+          <w:rFonts w:ascii="Arial" w:eastAsia="Arial" w:hAnsi="Arial" w:cs="Arial"/>
+          <w:sz w:val="28"/>
+          <w:szCs w:val="28"/>
+        </w:rPr>
+        <w:t xml:space="preserve">.</w:t>
+      </w:r>
+      <w:commentRangeEnd w:id="20"/>
       <w:r>
         <w:rPr>
           <w:rStyle w:val="CommentReference"/>
         </w:rPr>
-        <w:commentReference w:id="21"/>
+        <w:commentReference w:id="20"/>
       </w:r>
     </w:p>
     <w:p>
@@ -7096,30 +7630,57 @@
         <w:jc w:val="both"/>
         <w:rPr/>
       </w:pPr>
-      <w:r>
-        <w:rPr>
-          <w:rFonts w:ascii="Arial" w:eastAsia="Arial" w:hAnsi="Arial" w:cs="Arial"/>
-          <w:sz w:val="28"/>
-          <w:szCs w:val="28"/>
-        </w:rPr>
-        <w:t xml:space="preserve">A responsabilidade objetiva do fornecedor pressupõe defeito na prestação do serviço, dano e nexo causal</w:t>
-      </w:r>
-      <w:r>
-        <w:rPr>
-          <w:rFonts w:ascii="Arial" w:eastAsia="Arial" w:hAnsi="Arial" w:cs="Arial"/>
-          <w:color w:val="808080"/>
-          <w:sz w:val="28"/>
-          <w:szCs w:val="28"/>
-        </w:rPr>
-        <w:t xml:space="preserve"> (CDC 14)</w:t>
-      </w:r>
-      <w:r>
-        <w:rPr>
-          <w:rFonts w:ascii="Arial" w:eastAsia="Arial" w:hAnsi="Arial" w:cs="Arial"/>
-          <w:sz w:val="28"/>
-          <w:szCs w:val="28"/>
-        </w:rPr>
-        <w:t xml:space="preserve">.</w:t>
+      <w:commentRangeStart w:id="21"/>
+      <w:r>
+        <w:rPr>
+          <w:rFonts w:ascii="Arial" w:eastAsia="Arial" w:hAnsi="Arial" w:cs="Arial"/>
+          <w:sz w:val="28"/>
+          <w:szCs w:val="28"/>
+          <w:highlight w:val="yellow"/>
+        </w:rPr>
+        <w:t xml:space="preserve">Reconhecida a exigibilidade do débito, a cobrança e o registro correspondente constituem exercício regular de direito do credor</w:t>
+      </w:r>
+      <w:r>
+        <w:rPr>
+          <w:rFonts w:ascii="Arial" w:eastAsia="Arial" w:hAnsi="Arial" w:cs="Arial"/>
+          <w:sz w:val="28"/>
+          <w:szCs w:val="28"/>
+        </w:rPr>
+        <w:t xml:space="preserve">, </w:t>
+      </w:r>
+      <w:r>
+        <w:rPr>
+          <w:rFonts w:ascii="Arial" w:eastAsia="Arial" w:hAnsi="Arial" w:cs="Arial"/>
+          <w:color w:val="808080"/>
+          <w:sz w:val="28"/>
+          <w:szCs w:val="28"/>
+        </w:rPr>
+        <w:t xml:space="preserve">que não é ato ilícito, </w:t>
+      </w:r>
+      <w:r>
+        <w:rPr>
+          <w:rFonts w:ascii="Arial" w:eastAsia="Arial" w:hAnsi="Arial" w:cs="Arial"/>
+          <w:sz w:val="28"/>
+          <w:szCs w:val="28"/>
+        </w:rPr>
+        <w:t xml:space="preserve">nos termos do art. 188, I, do </w:t>
+      </w:r>
+      <w:r>
+        <w:rPr>
+          <w:rFonts w:ascii="Arial" w:eastAsia="Arial" w:hAnsi="Arial" w:cs="Arial"/>
+          <w:color w:val="808080"/>
+          <w:sz w:val="28"/>
+          <w:szCs w:val="28"/>
+        </w:rPr>
+        <w:t xml:space="preserve">CC:</w:t>
+      </w:r>
+      <w:commentRangeEnd w:id="21"/>
+      <w:r>
+        <w:rPr>
+          <w:rStyle w:val="CommentReference"/>
+          <w:color w:val="808080"/>
+        </w:rPr>
+        <w:commentReference w:id="21"/>
       </w:r>
     </w:p>
     <w:p>
@@ -7133,74 +7694,6 @@
     <w:p>
       <w:pPr>
         <w:spacing w:after="0" w:line="360" w:lineRule="auto"/>
-        <w:ind w:firstLine="2268"/>
-        <w:jc w:val="both"/>
-        <w:rPr/>
-      </w:pPr>
-      <w:commentRangeStart w:id="22"/>
-      <w:r>
-        <w:rPr>
-          <w:rFonts w:ascii="Arial" w:eastAsia="Arial" w:hAnsi="Arial" w:cs="Arial"/>
-          <w:sz w:val="28"/>
-          <w:szCs w:val="28"/>
-          <w:highlight w:val="yellow"/>
-        </w:rPr>
-        <w:t xml:space="preserve">Reconhecida a exigibilidade do débito, a cobrança e o registro correspondente constituem exercício regular de direito do credor</w:t>
-      </w:r>
-      <w:r>
-        <w:rPr>
-          <w:rFonts w:ascii="Arial" w:eastAsia="Arial" w:hAnsi="Arial" w:cs="Arial"/>
-          <w:sz w:val="28"/>
-          <w:szCs w:val="28"/>
-        </w:rPr>
-        <w:t xml:space="preserve">, </w:t>
-      </w:r>
-      <w:r>
-        <w:rPr>
-          <w:rFonts w:ascii="Arial" w:eastAsia="Arial" w:hAnsi="Arial" w:cs="Arial"/>
-          <w:color w:val="808080"/>
-          <w:sz w:val="28"/>
-          <w:szCs w:val="28"/>
-        </w:rPr>
-        <w:t xml:space="preserve">que não é ato ilícito, </w:t>
-      </w:r>
-      <w:r>
-        <w:rPr>
-          <w:rFonts w:ascii="Arial" w:eastAsia="Arial" w:hAnsi="Arial" w:cs="Arial"/>
-          <w:sz w:val="28"/>
-          <w:szCs w:val="28"/>
-        </w:rPr>
-        <w:t xml:space="preserve">nos termos do art. 188, I, do </w:t>
-      </w:r>
-      <w:r>
-        <w:rPr>
-          <w:rFonts w:ascii="Arial" w:eastAsia="Arial" w:hAnsi="Arial" w:cs="Arial"/>
-          <w:color w:val="808080"/>
-          <w:sz w:val="28"/>
-          <w:szCs w:val="28"/>
-        </w:rPr>
-        <w:t xml:space="preserve">CC:</w:t>
-      </w:r>
-      <w:commentRangeEnd w:id="22"/>
-      <w:r>
-        <w:rPr>
-          <w:rStyle w:val="CommentReference"/>
-          <w:color w:val="808080"/>
-        </w:rPr>
-        <w:commentReference w:id="22"/>
-      </w:r>
-    </w:p>
-    <w:p>
-      <w:pPr>
-        <w:spacing w:after="0" w:line="360" w:lineRule="auto"/>
-        <w:ind w:firstLine="2268"/>
-        <w:jc w:val="both"/>
-        <w:rPr/>
-      </w:pPr>
-    </w:p>
-    <w:p>
-      <w:pPr>
-        <w:spacing w:after="0" w:line="360" w:lineRule="auto"/>
         <w:ind w:left="2268" w:firstLine="0"/>
         <w:jc w:val="both"/>
         <w:rPr/>
@@ -7214,44 +7707,28 @@
           <w:sz w:val="26"/>
           <w:szCs w:val="28"/>
         </w:rPr>
-        <w:t xml:space="preserve">“Art. 188. Não constituem atos ilícitos:</w:t>
-      </w:r>
-    </w:p>
-    <w:p>
-      <w:pPr>
-        <w:spacing w:after="0" w:line="360" w:lineRule="auto"/>
-        <w:ind w:left="2268" w:firstLine="0"/>
-        <w:jc w:val="both"/>
-        <w:rPr/>
-      </w:pPr>
-      <w:r>
-        <w:rPr>
-          <w:rFonts w:ascii="Arial" w:hAnsi="Arial"/>
+        <w:t xml:space="preserve">“Art. 188. Não constituem atos ilícitos: I - os praticados em legítima defesa ou </w:t>
+      </w:r>
+      <w:r>
+        <w:rPr>
+          <w:rFonts w:ascii="Arial" w:eastAsia="Arial" w:hAnsi="Arial" w:cs="Arial"/>
           <w:b w:val="0"/>
           <w:i/>
           <w:color w:val="808080"/>
           <w:sz w:val="26"/>
-        </w:rPr>
-        <w:t xml:space="preserve">I - os praticados em legítima defesa ou </w:t>
-      </w:r>
-      <w:r>
-        <w:rPr>
-          <w:rFonts w:ascii="Arial" w:hAnsi="Arial"/>
+          <w:szCs w:val="28"/>
+          <w:u w:val="single"/>
+        </w:rPr>
+        <w:t xml:space="preserve">no exercício regular de um direito reconhecido</w:t>
+      </w:r>
+      <w:r>
+        <w:rPr>
+          <w:rFonts w:ascii="Arial" w:eastAsia="Arial" w:hAnsi="Arial" w:cs="Arial"/>
           <w:b w:val="0"/>
           <w:i/>
           <w:color w:val="808080"/>
           <w:sz w:val="26"/>
-          <w:u w:val="single"/>
-        </w:rPr>
-        <w:t xml:space="preserve">no exercício regular de um direito reconhecido</w:t>
-      </w:r>
-      <w:r>
-        <w:rPr>
-          <w:rFonts w:ascii="Arial" w:hAnsi="Arial"/>
-          <w:b w:val="0"/>
-          <w:i/>
-          <w:color w:val="808080"/>
-          <w:sz w:val="26"/>
+          <w:szCs w:val="28"/>
         </w:rPr>
         <w:t xml:space="preserve">;” – Grifei</w:t>
       </w:r>
@@ -7279,7 +7756,7 @@
           <w:color w:val="808080"/>
           <w:sz w:val="28"/>
         </w:rPr>
-        <w:t xml:space="preserve">No caso, não há falha na prestação do serviço nem informação cadastral inverídica.</w:t>
+        <w:t xml:space="preserve">No caso, não há falha na prestação do serviço nem informação cadastral inverídica (CDC 14).</w:t>
       </w:r>
     </w:p>
     <w:p>
@@ -7332,7 +7809,23 @@
           <w:sz w:val="28"/>
           <w:szCs w:val="28"/>
         </w:rPr>
-        <w:t xml:space="preserve"> não há prova do alegado excesso de cobranças nem de redução concreta da pontuação de crédito ou de restrição ao acesso ao crédito.</w:t>
+        <w:t xml:space="preserve"> não há prova do alegado excesso de cobranças nem de redução </w:t>
+      </w:r>
+      <w:r>
+        <w:rPr>
+          <w:rFonts w:ascii="Arial" w:eastAsia="Arial" w:hAnsi="Arial" w:cs="Arial"/>
+          <w:sz w:val="28"/>
+          <w:szCs w:val="28"/>
+        </w:rPr>
+        <w:t xml:space="preserve">da pontuação de crédito</w:t>
+      </w:r>
+      <w:r>
+        <w:rPr>
+          <w:rFonts w:ascii="Arial" w:eastAsia="Arial" w:hAnsi="Arial" w:cs="Arial"/>
+          <w:sz w:val="28"/>
+          <w:szCs w:val="28"/>
+        </w:rPr>
+        <w:t xml:space="preserve">.</w:t>
       </w:r>
     </w:p>
     <w:p>
@@ -7363,7 +7856,23 @@
           <w:sz w:val="28"/>
           <w:szCs w:val="28"/>
         </w:rPr>
-        <w:t xml:space="preserve">no recurso partem de premissa fática diversa, qual seja, a ausência de prova da contratação, o que não ocorre no caso.</w:t>
+        <w:t xml:space="preserve">no recurso partem de premissa </w:t>
+      </w:r>
+      <w:r>
+        <w:rPr>
+          <w:rFonts w:ascii="Arial" w:eastAsia="Arial" w:hAnsi="Arial" w:cs="Arial"/>
+          <w:sz w:val="28"/>
+          <w:szCs w:val="28"/>
+        </w:rPr>
+        <w:t xml:space="preserve">diversa</w:t>
+      </w:r>
+      <w:r>
+        <w:rPr>
+          <w:rFonts w:ascii="Arial" w:eastAsia="Arial" w:hAnsi="Arial" w:cs="Arial"/>
+          <w:sz w:val="28"/>
+          <w:szCs w:val="28"/>
+        </w:rPr>
+        <w:t xml:space="preserve">, a ausência de prova da contratação, o que não ocorre no caso.</w:t>
       </w:r>
     </w:p>
     <w:p>
@@ -7552,8 +8061,8 @@
         <w:ind w:firstLine="2268"/>
         <w:jc w:val="both"/>
       </w:pPr>
+      <w:commentRangeStart w:id="22"/>
       <w:commentRangeStart w:id="23"/>
-      <w:commentRangeStart w:id="24"/>
       <w:r>
         <w:rPr>
           <w:rFonts w:ascii="Arial" w:hAnsi="Arial" w:cs="Arial"/>
@@ -7771,19 +8280,19 @@
         </w:rPr>
         <w:t xml:space="preserve">º).</w:t>
       </w:r>
-      <w:commentRangeEnd w:id="24"/>
+      <w:commentRangeEnd w:id="23"/>
       <w:r>
         <w:rPr>
           <w:rStyle w:val="CommentReference"/>
         </w:rPr>
-        <w:commentReference w:id="24"/>
-      </w:r>
-      <w:commentRangeEnd w:id="23"/>
+        <w:commentReference w:id="23"/>
+      </w:r>
+      <w:commentRangeEnd w:id="22"/>
       <w:r>
         <w:rPr>
           <w:rStyle w:val="CommentReference"/>
         </w:rPr>
-        <w:commentReference w:id="23"/>
+        <w:commentReference w:id="22"/>
       </w:r>
     </w:p>
     <w:p>
@@ -8326,7 +8835,7 @@
       </w:r>
     </w:p>
   </w:comment>
-  <w:comment w:id="5" w:author="Assessor GDSXSR" w:initials="AG" w:date="2026-10-29T21:18:31Z">
+  <w:comment w:id="5" w:author="Assessor GDSXSR" w:initials="AG" w:date="2026-10-30T19:46:32Z">
     <w:p>
       <w:pPr>
         <w:pStyle w:val="CommentText"/>
@@ -8342,7 +8851,7 @@
       </w:r>
     </w:p>
   </w:comment>
-  <w:comment w:id="6" w:author="Assessor GDSXSR" w:initials="AG" w:date="2026-10-29T21:18:31Z">
+  <w:comment w:id="6" w:author="Assessor GDSXSR" w:initials="AG" w:date="2026-10-30T19:46:32Z">
     <w:p>
       <w:pPr>
         <w:pStyle w:val="CommentText"/>
@@ -8358,7 +8867,7 @@
       </w:r>
     </w:p>
   </w:comment>
-  <w:comment w:id="7" w:author="Assessor GDSXSR" w:initials="AG" w:date="2026-10-29T21:18:31Z">
+  <w:comment w:id="7" w:author="Assessor GDSXSR" w:initials="AG" w:date="2026-10-30T19:46:32Z">
     <w:p>
       <w:pPr>
         <w:pStyle w:val="CommentText"/>
@@ -8374,7 +8883,7 @@
       </w:r>
     </w:p>
   </w:comment>
-  <w:comment w:id="8" w:author="Assessor GDSXSR" w:initials="AG" w:date="2026-10-29T21:18:31Z">
+  <w:comment w:id="8" w:author="Assessor GDSXSR" w:initials="AG" w:date="2026-10-30T19:46:32Z">
     <w:p>
       <w:pPr>
         <w:pStyle w:val="CommentText"/>
@@ -8386,11 +8895,11 @@
         <w:annotationRef/>
       </w:r>
       <w:r>
-        <w:t>ASSESSOR GDSXSR — Troquei “MMª.” por “MM.” (fórmula do perfil APC). Pendência (C-22, C-52): sem acesso ao PJe, não confirmei o nome da magistrada (Márcia Regina Araújo Lima) nem a vara; a sentença anexa não traz assinatura.</w:t>
+        <w:t>ASSESSOR GDSXSR — Troquei “MMª.” por “MM.” (fórmula do perfil APC). Nome da magistrada conferido nos autos de origem: sentença (ID 89866233) assinada eletronicamente por Márcia Regina Araújo Lima, Juíza de Direito Substituta, em 13/08/2026, 2ª Vara Cível, de Família e de Órfãos e Sucessões de Brazlândia (C-22).</w:t>
       </w:r>
     </w:p>
   </w:comment>
-  <w:comment w:id="9" w:author="Assessor GDSXSR" w:initials="AG" w:date="2026-10-29T21:18:31Z">
+  <w:comment w:id="9" w:author="Assessor GDSXSR" w:initials="AG" w:date="2026-10-30T19:46:32Z">
     <w:p>
       <w:pPr>
         <w:pStyle w:val="CommentText"/>
@@ -8406,7 +8915,7 @@
       </w:r>
     </w:p>
   </w:comment>
-  <w:comment w:id="10" w:author="Assessor GDSXSR" w:initials="AG" w:date="2026-10-29T21:18:31Z">
+  <w:comment w:id="10" w:author="Assessor GDSXSR" w:initials="AG" w:date="2026-10-30T19:46:32Z">
     <w:p>
       <w:pPr>
         <w:pStyle w:val="CommentText"/>
@@ -8418,11 +8927,11 @@
         <w:annotationRef/>
       </w:r>
       <w:r>
-        <w:t>ASSESSOR GDSXSR — Acrescentei a linha de admissibilidade logo depois do título do recurso (perfil APC). A gratuidade foi deferida na sentença (ID 89866233), o que dispensa o preparo; não conferi a data de publicação da sentença nem a tempestividade, porque os autos não foram recebidos (C-24).</w:t>
+        <w:t>ASSESSOR GDSXSR — Acrescentei a linha de admissibilidade logo depois do título do recurso (perfil APC). Conferi nos autos de origem: a sentença foi disponibilizada no DJEN em 18/08/2026 (certidão ID 89866235) e publicada em 19/08/2026; o apelo foi interposto em 03/09/2026, dentro de 15 dias úteis (CPC 1.003 § 5º). A gratuidade foi deferida na sentença (ID 89866233), o que dispensa o preparo.</w:t>
       </w:r>
     </w:p>
   </w:comment>
-  <w:comment w:id="11" w:author="Assessor GDSXSR" w:initials="AG" w:date="2026-10-29T21:18:31Z">
+  <w:comment w:id="11" w:author="Assessor GDSXSR" w:initials="AG" w:date="2026-10-30T19:46:32Z">
     <w:p>
       <w:pPr>
         <w:pStyle w:val="CommentText"/>
@@ -8438,7 +8947,7 @@
       </w:r>
     </w:p>
   </w:comment>
-  <w:comment w:id="12" w:author="Assessor GDSXSR" w:initials="AG" w:date="2026-10-29T21:18:31Z">
+  <w:comment w:id="12" w:author="Assessor GDSXSR" w:initials="AG" w:date="2026-10-30T19:46:32Z">
     <w:p>
       <w:pPr>
         <w:pStyle w:val="CommentText"/>
@@ -8450,11 +8959,11 @@
         <w:annotationRef/>
       </w:r>
       <w:r>
-        <w:t>ASSESSOR GDSXSR — Troquei “A apelante” por “A autora/apelante” (C-3W c); o nome permanece no título do recurso.</w:t>
+        <w:t>ASSESSOR GDSXSR — Troquei “A apelante” por “A autora/apelante” (C-3W c) e condensei as alegações, fundindo as quatro em três e retirando o que o voto não enfrenta de forma autônoma (incidência do CDC), sem perder nenhuma tese do apelo (C-02, C-30).</w:t>
       </w:r>
     </w:p>
   </w:comment>
-  <w:comment w:id="13" w:author="Assessor GDSXSR" w:initials="AG" w:date="2026-10-29T21:18:31Z">
+  <w:comment w:id="13" w:author="Assessor GDSXSR" w:initials="AG" w:date="2026-10-30T19:46:32Z">
     <w:p>
       <w:pPr>
         <w:pStyle w:val="CommentText"/>
@@ -8466,11 +8975,11 @@
         <w:annotationRef/>
       </w:r>
       <w:r>
-        <w:t>ASSESSOR GDSXSR — Texto literal (C-63) — CDC, art. 6º, VIII: “a facilitação da defesa de seus direitos, inclusive com a inversão do ônus da prova, a seu favor, no processo civil, quando, a critério do juiz, for verossímil a alegação ou quando for ele hipossuficiente, segundo as regras ordinárias de experiências;” (fonte: Planalto, via iajus). Passei a referência para a forma compacta (C-20).</w:t>
+        <w:t>ASSESSOR GDSXSR — Texto literal (C-63) — CDC, art. 6º, VIII: “a facilitação da defesa de seus direitos, inclusive com a inversão do ônus da prova, a seu favor, no processo civil, quando, a critério do juiz, for verossímil a alegação ou quando for ele hipossuficiente, segundo as regras ordinárias de experiências;” (fonte: Planalto, via iajus). Fundi neste parágrafo a primeira frase do seguinte, para dizer que a inversão foi afastada (C-02, C-11).</w:t>
       </w:r>
     </w:p>
   </w:comment>
-  <w:comment w:id="14" w:author="Assessor GDSXSR" w:initials="AG" w:date="2026-10-29T21:18:31Z">
+  <w:comment w:id="14" w:author="Assessor GDSXSR" w:initials="AG" w:date="2026-10-30T19:46:32Z">
     <w:p>
       <w:pPr>
         <w:pStyle w:val="CommentText"/>
@@ -8482,11 +8991,11 @@
         <w:annotationRef/>
       </w:r>
       <w:r>
-        <w:t>ASSESSOR GDSXSR — Esclareci que o sujeito de “foi corretamente afastada” é a inversão do ônus da prova, cindi o parágrafo (C-11, C-12) e troquei “Além disso” por “Decerto,” (C-16, C-23). Texto literal (C-63) — CPC, art. 373: “O ônus da prova incumbe: (...) II - ao réu, quanto à existência de fato impeditivo, modificativo ou extintivo do direito do autor.” (fonte: Planalto, via iajus).</w:t>
+        <w:t>ASSESSOR GDSXSR — Troquei “Além disso” por “De todo modo,” (C-16, C-23). Texto literal (C-63) — CPC, art. 373: “O ônus da prova incumbe: (...) II - ao réu, quanto à existência de fato impeditivo, modificativo ou extintivo do direito do autor.” (fonte: Planalto, via iajus).</w:t>
       </w:r>
     </w:p>
   </w:comment>
-  <w:comment w:id="15" w:author="Assessor GDSXSR" w:initials="AG" w:date="2026-10-29T21:18:31Z">
+  <w:comment w:id="15" w:author="Assessor GDSXSR" w:initials="AG" w:date="2026-10-30T19:46:32Z">
     <w:p>
       <w:pPr>
         <w:pStyle w:val="CommentText"/>
@@ -8498,11 +9007,11 @@
         <w:annotationRef/>
       </w:r>
       <w:r>
-        <w:t>ASSESSOR GDSXSR — Cindi o parágrafo em três (C-11, C-12). Pendência (C-20, C-52): o comprovante de residência e a procuração da inicial aparecem na sentença pelos IDs de 1º grau (263139965 e 263139954); sem acesso ao PJe de 2º grau, não os converti para a série de IDs do recurso. Conferir e acrescentar o ID ao final do segundo período.</w:t>
+        <w:t>ASSESSOR GDSXSR — Condensei em um período, com os IDs de 2º grau conferidos nos autos de origem: contrato e documentos da contestação (ID 89866219), comprovante de residência (ID 89865953), procuração (ID 89865946) e identidade (ID 89865947). A sentença os cita pelos IDs de 1º grau (263139965, 263139954). Ressalva: no OCR do contrato (ID 89866219, pág. 4) o logradouro aparece como “INCRA 3”, e no comprovante de residência como “Incra 7”; o CEP (72773-010) e a localidade (Brazlândia) coincidem e a sentença afirma que o endereço é o mesmo. Conferir a imagem do contrato.</w:t>
       </w:r>
     </w:p>
   </w:comment>
-  <w:comment w:id="16" w:author="Assessor GDSXSR" w:initials="AG" w:date="2026-10-29T21:18:31Z">
+  <w:comment w:id="16" w:author="Assessor GDSXSR" w:initials="AG" w:date="2026-10-30T19:46:32Z">
     <w:p>
       <w:pPr>
         <w:pStyle w:val="CommentText"/>
@@ -8514,11 +9023,11 @@
         <w:annotationRef/>
       </w:r>
       <w:r>
-        <w:t>ASSESSOR GDSXSR — Acrescentei, em uma frase, o que a r. sentença já registrou, porque o apelo alega ausência de prova de utilização do serviço. Não há fato novo nem alteração de resultado (C-3, C-24). Conferir, nos autos de 2º grau, o ID dos documentos a que a sentença se refere.</w:t>
+        <w:t>ASSESSOR GDSXSR — Enfrentei o Tema 1.061/STJ, invocado no apelo, com a tese literal (C-53, C-61) e extraí do parágrafo a consequência já afirmada na minuta. Tese integral conferida no iajus (STJ, Tema Repetitivo 1.061, vigente, julgado em 24/11/2021). Pendência (C-52): o REsp 1.846.649/MA e o DJe de 09/12/2021 vieram de fonte secundária (informativos.trilhante.com.br), pois o portal do STJ não abriu; conferir o DJe no SCON. Conferi nos autos de origem: o apelo (ID 89866236) invoca o Tema 1.061, e a réplica (ID 89866229) reafirma a inexistência da contratação e pede a juntada do contrato, sem impugnar especificamente a assinatura nem pedir perícia grafotécnica.</w:t>
       </w:r>
     </w:p>
   </w:comment>
-  <w:comment w:id="17" w:author="Assessor GDSXSR" w:initials="AG" w:date="2026-10-29T21:18:31Z">
+  <w:comment w:id="17" w:author="Assessor GDSXSR" w:initials="AG" w:date="2026-10-30T19:46:32Z">
     <w:p>
       <w:pPr>
         <w:pStyle w:val="CommentText"/>
@@ -8530,11 +9039,11 @@
         <w:annotationRef/>
       </w:r>
       <w:r>
-        <w:t>ASSESSOR GDSXSR — Enfrentei o Tema 1.061/STJ, invocado no apelo, com a tese literal (C-53, C-61) e extraí do parágrafo a consequência já afirmada na minuta (sem impugnação específica da assinatura, o ônus não se transfere). Tese integral conferida no iajus (STJ, Tema Repetitivo 1.061, vigente, julgado em 24/11/2021). Pendência (C-52): o REsp 1.846.649/MA e o DJe de 09/12/2021 vieram de fonte secundária (informativos.trilhante.com.br), pois o portal do STJ não abriu; conferir o DJe no SCON. A afirmação de que a apelante não impugnou especificamente a assinatura é da minuta; conferir nas razões do apelo (autos não recebidos, C-24).</w:t>
+        <w:t>ASSESSOR GDSXSR — Cindi o parágrafo, troquei “Além disso … igualmente” por “Por outro lado … também” (C-16, C-23) e condensei: a transcrição fica só com o art. 293 do CC, que fundamenta os atos conservatórios (C-66); o art. 286 vai ao comentário (C-63). Texto literal — CC, art. 286: “O credor pode ceder o seu crédito, se a isso não se opuser a natureza da obrigação, a lei, ou a convenção com o devedor; a cláusula proibitiva da cessão não poderá ser oposta ao cessionário de boa-fé, se não constar do instrumento da obrigação.” (fonte: Planalto, via iajus). Certidão conferida nos autos de origem (ID 89866219).</w:t>
       </w:r>
     </w:p>
   </w:comment>
-  <w:comment w:id="18" w:author="Assessor GDSXSR" w:initials="AG" w:date="2026-10-29T21:18:31Z">
+  <w:comment w:id="18" w:author="Assessor GDSXSR" w:initials="AG" w:date="2026-10-30T19:46:32Z">
     <w:p>
       <w:pPr>
         <w:pStyle w:val="CommentText"/>
@@ -8546,11 +9055,11 @@
         <w:annotationRef/>
       </w:r>
       <w:r>
-        <w:t>ASSESSOR GDSXSR — Cindi o parágrafo, troquei “Além disso … igualmente” por “Por outro lado … também” (C-16, C-23) e passei os arts. 286 e 293 do CC para a forma de C-66: a norma que sustenta a cessão fica transcrita no corpo, em bloco com “(...)”, e a conclusão da minuta (anuência, notificação, atos conservatórios) vem depois dela. Texto literal conferido no Planalto, via iajus (CC, arts. 286 e 293).</w:t>
+        <w:t>ASSESSOR GDSXSR — Ajustei a transcrição da ementa (C-62) e a enxuguei (C-02): mantive os itens 9, 10 (primeira frase) e 12, que tratam da cessão, da ausência de notificação e do exercício regular de direito; suprimi os itens 8, 11, 13, a segunda frase do item 10, o item 14 e “IV. Dispositivo e teses”; trechos essenciais sublinhados, fecho com “(...)” e “– Grifei”. Troquei a introdução por “Nesse sentido:” (C-67). O acórdão é da 7ª Turma Cível; a pendência de conferência está no comentário da ementa (C-72).</w:t>
       </w:r>
     </w:p>
   </w:comment>
-  <w:comment w:id="19" w:author="Assessor GDSXSR" w:initials="AG" w:date="2026-10-29T21:18:31Z">
+  <w:comment w:id="19" w:author="Assessor GDSXSR" w:initials="AG" w:date="2026-10-30T19:46:32Z">
     <w:p>
       <w:pPr>
         <w:pStyle w:val="CommentText"/>
@@ -8562,11 +9071,11 @@
         <w:annotationRef/>
       </w:r>
       <w:r>
-        <w:t>ASSESSOR GDSXSR — Ajustei a transcrição da ementa (C-62): aspas de abertura, itens 8 a 13 mantidos, itens 14 e “IV. Dispositivo e teses” suprimidos por não terem relação com os pontos decididos, trechos essenciais sublinhados, fecho com “(...)” e “– Grifei”. Troquei a introdução por “Nesse sentido:” (C-67). O acórdão é da 7ª Turma Cível; a pendência de conferência está no comentário da ementa (C-72).</w:t>
+        <w:t>ASSESSOR GDSXSR — Alterei o título para dizer a decisão sobre o pedido de indenização (C-3W b), e o realcei (C-42).</w:t>
       </w:r>
     </w:p>
   </w:comment>
-  <w:comment w:id="20" w:author="Assessor GDSXSR" w:initials="AG" w:date="2026-10-29T21:18:31Z">
+  <w:comment w:id="20" w:author="Assessor GDSXSR" w:initials="AG" w:date="2026-10-30T19:46:32Z">
     <w:p>
       <w:pPr>
         <w:pStyle w:val="CommentText"/>
@@ -8578,11 +9087,11 @@
         <w:annotationRef/>
       </w:r>
       <w:r>
-        <w:t>ASSESSOR GDSXSR — Alterei o título para dizer a decisão sobre o pedido de indenização (C-3W b), e o realcei (C-42).</w:t>
+        <w:t>ASSESSOR GDSXSR — Troquei “A apelante sustenta, em síntese,” por “A autora/apelante alega” (C-3W c). Texto literal (C-63) — CDC, art. 14, caput: “O fornecedor de serviços responde, independentemente da existência de culpa, pela reparação dos danos causados aos consumidores por defeitos relativos à prestação dos serviços, bem como por informações insuficientes ou inadequadas sobre sua fruição e riscos.” CDC, art. 43, § 1º: “Os cadastros e dados de consumidores devem ser objetivos, claros, verdadeiros e em linguagem de fácil compreensão, não podendo conter informações negativas referentes a período superior a cinco anos.” (fonte: Planalto, via iajus).</w:t>
       </w:r>
     </w:p>
   </w:comment>
-  <w:comment w:id="21" w:author="Assessor GDSXSR" w:initials="AG" w:date="2026-10-29T21:18:31Z">
+  <w:comment w:id="21" w:author="Assessor GDSXSR" w:initials="AG" w:date="2026-10-30T19:46:32Z">
     <w:p>
       <w:pPr>
         <w:pStyle w:val="CommentText"/>
@@ -8594,11 +9103,11 @@
         <w:annotationRef/>
       </w:r>
       <w:r>
-        <w:t>ASSESSOR GDSXSR — Troquei “A apelante sustenta, em síntese,” por “A autora/apelante alega” (C-3W c). Texto literal (C-63) — CDC, art. 14, caput: “O fornecedor de serviços responde, independentemente da existência de culpa, pela reparação dos danos causados aos consumidores por defeitos relativos à prestação dos serviços, bem como por informações insuficientes ou inadequadas sobre sua fruição e riscos.” CDC, art. 43, § 1º: “Os cadastros e dados de consumidores devem ser objetivos, claros, verdadeiros e em linguagem de fácil compreensão, não podendo conter informações negativas referentes a período superior a cinco anos.” (fonte: Planalto, via iajus).</w:t>
+        <w:t>ASSESSOR GDSXSR — Condensei o parágrafo: suprimi a frase inicial sobre a responsabilidade objetiva, que o apelo já traz e que a referência ao CDC 14 na última frase supre, e juntei o caput e o inciso I do art. 188 do CC em um só bloco (C-02, C-66 a). Texto literal conferido no Planalto, via iajus.</w:t>
       </w:r>
     </w:p>
   </w:comment>
-  <w:comment w:id="22" w:author="Assessor GDSXSR" w:initials="AG" w:date="2026-10-29T21:18:31Z">
+  <w:comment w:id="22" w:author="Assessor GDSXSR" w:initials="AG" w:date="2026-10-30T19:46:32Z">
     <w:p>
       <w:pPr>
         <w:pStyle w:val="CommentText"/>
@@ -8610,11 +9119,11 @@
         <w:annotationRef/>
       </w:r>
       <w:r>
-        <w:t>ASSESSOR GDSXSR — Cindi o parágrafo, acrescentei a referência compacta ao CDC 14 (C-20) e transcrevi o art. 188, I, do CC, que sustenta o capítulo (C-66 a). Texto literal conferido no Planalto, via iajus. A última frase do parágrafo original passou para depois da transcrição, sem mudança de texto.</w:t>
+        <w:t>ASSESSOR GDSXSR — Ajustei a fórmula do dispositivo (C-20, C-51, perfil APC, n. 7). Valor atualizado da causa: R$ 46.011,44 na linha de dados do voto (2% = R$ 920,23, antes da atualização). R. sentença (ID 89866233): “Condeno a parte autora ao pagamento das custas processuais e honorários advocatícios, que arbitro em dez por cento (10%) sobre o valor da causa, nos termos do art. 85, § 2º, do Código de Processo Civil. Suspensa a exigibilidade por ser beneficiária da justiça gratuita, que ora defiro.” Somados (10% + 2%), os honorários ficam dentro do limite de 20% do CPC 85 § 11. O percentual de 2% é decisão do Relator.</w:t>
       </w:r>
     </w:p>
   </w:comment>
-  <w:comment w:id="23" w:author="Assessor GDSXSR" w:initials="AG" w:date="2026-10-29T21:18:31Z">
+  <w:comment w:id="23" w:author="Assessor GDSXSR" w:initials="AG" w:date="2026-10-30T19:46:32Z">
     <w:p>
       <w:pPr>
         <w:pStyle w:val="CommentText"/>
@@ -8626,11 +9135,11 @@
         <w:annotationRef/>
       </w:r>
       <w:r>
-        <w:t>ASSESSOR GDSXSR — Ajustei a fórmula do dispositivo (C-20, C-51, perfil APC, n. 7). Valor atualizado da causa: R$ 46.011,44 na linha de dados do voto (2% = R$ 920,23, antes da atualização). R. sentença (ID 89866233): “Condeno a parte autora ao pagamento das custas processuais e honorários advocatícios, que arbitro em dez por cento (10%) sobre o valor da causa, nos termos do art. 85, § 2º, do Código de Processo Civil. Suspensa a exigibilidade por ser beneficiária da justiça gratuita, que ora defiro.” Somados (10% + 2%), os honorários ficam dentro do limite de 20% do CPC 85 § 11. O percentual de 2% é decisão do Relator.</w:t>
+        <w:t>ASSESSOR GDSXSR — Texto literal (C-63) — CPC, art. 85, § 11: “O tribunal, ao julgar recurso, majorará os honorários fixados anteriormente levando em conta o trabalho adicional realizado em grau recursal, observando, conforme o caso, o disposto nos §§ 2º a 6º, sendo vedado ao tribunal, no cômputo geral da fixação de honorários devidos ao advogado do vencedor, ultrapassar os respectivos limites estabelecidos nos §§ 2º e 3º para a fase de conhecimento.” CPC, art. 98, § 3º: “Vencido o beneficiário, as obrigações decorrentes de sua sucumbência ficarão sob condição suspensiva de exigibilidade e somente poderão ser executadas se, nos 5 (cinco) anos subsequentes ao trânsito em julgado da decisão que as certificou, o credor demonstrar que deixou de existir a situação de insuficiência de recursos que justificou a concessão de gratuidade, extinguindo-se, passado esse prazo, tais obrigações do beneficiário.” (fonte: Planalto, via iajus).</w:t>
       </w:r>
     </w:p>
   </w:comment>
-  <w:comment w:id="24" w:author="Assessor GDSXSR" w:initials="AG" w:date="2026-10-29T21:18:31Z">
+  <w:comment w:id="24" w:author="Assessor GDSXSR" w:initials="AG" w:date="2026-10-30T19:46:32Z">
     <w:p>
       <w:pPr>
         <w:pStyle w:val="CommentText"/>
@@ -8642,23 +9151,7 @@
         <w:annotationRef/>
       </w:r>
       <w:r>
-        <w:t>ASSESSOR GDSXSR — Texto literal (C-63) — CPC, art. 85, § 11: “O tribunal, ao julgar recurso, majorará os honorários fixados anteriormente levando em conta o trabalho adicional realizado em grau recursal, observando, conforme o caso, o disposto nos §§ 2º a 6º, sendo vedado ao tribunal, no cômputo geral da fixação de honorários devidos ao advogado do vencedor, ultrapassar os respectivos limites estabelecidos nos §§ 2º e 3º para a fase de conhecimento.” CPC, art. 98, § 3º: “Vencido o beneficiário, as obrigações decorrentes de sua sucumbência ficarão sob condição suspensiva de exigibilidade e somente poderão ser executadas se, nos 5 (cinco) anos subsequentes ao trânsito em julgado da decisão que as certificou, o credor demonstrar que deixou de existir a situação de insuficiência de recursos que justificou a concessão de gratuidade, extinguindo-se, passado esse prazo, tais obrigações do beneficiário.” (fonte: Planalto, via iajus).</w:t>
-      </w:r>
-    </w:p>
-  </w:comment>
-  <w:comment w:id="25" w:author="Assessor GDSXSR" w:initials="AG" w:date="2026-10-29T21:18:31Z">
-    <w:p>
-      <w:pPr>
-        <w:pStyle w:val="CommentText"/>
-      </w:pPr>
-      <w:r>
-        <w:rPr>
-          <w:rStyle w:val="CommentReference"/>
-        </w:rPr>
-        <w:annotationRef/>
-      </w:r>
-      <w:r>
-        <w:t>ASSESSOR GDSXSR — Alterações de forma em todo o documento: referências normativas na forma compacta (C-20); grafia e pontuação (C-28); realce amarelo nos subtítulos, vereditos e frases decisórias (C-42, C-43); cisão de parágrafos longos (C-11, C-12); transcrições de norma e de tese em Arial 13 itálico, recuo de 4 cm (C-40, C-41, C-66). Preservei a tabela de autuação, o cabeçalho, o resumo em vermelho (só conferi a grafia, C-39) e a sentença anexa (C-4, C-45). Não alterei fatos, pedidos, valores, datas nem o resultado (C-03). Autos de 2º grau não recebidos: IDs e fatos conferidos apenas contra o texto da minuta e da sentença (C-24).</w:t>
+        <w:t>ASSESSOR GDSXSR — Alterações de forma em todo o documento: referências normativas na forma compacta (C-20); grafia e pontuação (C-28); realce amarelo nos subtítulos, vereditos e frases decisórias (C-42, C-43); cisão de parágrafos longos (C-11, C-12); transcrições de norma e de tese em Arial 13 itálico, recuo de 4 cm (C-40, C-41, C-66). Preservei a tabela de autuação, o cabeçalho, o resumo em vermelho (só conferi a grafia, C-39) e a sentença anexa (C-4, C-45). Não alterei fatos, pedidos, valores, datas nem o resultado (C-03). Conferi fatos, IDs, datas e o nome da magistrada contra os autos de origem (arquivo de 30/10/2026). Enxugamento pedido por Marcos (C-02): ementa −22% (507→397 palavras) e fundamentação do voto −35% (1.144→747 palavras, do título do apelo ao fim do capítulo 2) sobre a primeira revisão, sem tirar fato, pedido, valor, data nem resultado.</w:t>
       </w:r>
     </w:p>
   </w:comment>

</xml_diff>